<commit_message>
Ridizajno prezantimin e konferencës
Tituj që thonë gjetjen, diagrame në vend të tekstit dhe hartë RQ; teksti folës mbetet i njëjtë.
</commit_message>
<xml_diff>
--- a/docs/konferenca/UBT2026_cka_te_flas.docx
+++ b/docs/konferenca/UBT2026_cka_te_flas.docx
@@ -68,6 +68,14 @@
       </w:pPr>
       <w:r>
         <w:t>Lexoje një herë të gjithin me zë, me sllajdet hapur pranë, dhe trego me gisht atë që thotë «Ku të tregosh».</w:t>
+      </w:r>
+    </w:p>
+    <w:p>
+      <w:pPr>
+        <w:pStyle w:val="ListBullet"/>
+      </w:pPr>
+      <w:r>
+        <w:t>Lart djathtas, nga sllajdi 4 te 8, etiketat RQ1 · RQ2 · RQ3 tregojnë për cilën pyetje flet sllajdi; ajo me blu është pyetja e tanishme. Nuk ke nevojë ta thuash: salla e sheh vetë.</w:t>
       </w:r>
     </w:p>
     <w:p>
@@ -110,7 +118,7 @@
         </w:tc>
         <w:tc>
           <w:tcPr>
-            <w:tcW w:type="dxa" w:w="1928"/>
+            <w:tcW w:type="dxa" w:w="2835"/>
           </w:tcPr>
           <w:p>
             <w:r>
@@ -120,7 +128,7 @@
         </w:tc>
         <w:tc>
           <w:tcPr>
-            <w:tcW w:type="dxa" w:w="4876"/>
+            <w:tcW w:type="dxa" w:w="3969"/>
           </w:tcPr>
           <w:p>
             <w:r>
@@ -162,7 +170,7 @@
         </w:tc>
         <w:tc>
           <w:tcPr>
-            <w:tcW w:type="dxa" w:w="1928"/>
+            <w:tcW w:type="dxa" w:w="2835"/>
           </w:tcPr>
           <w:p>
             <w:r>
@@ -172,7 +180,7 @@
         </w:tc>
         <w:tc>
           <w:tcPr>
-            <w:tcW w:type="dxa" w:w="4876"/>
+            <w:tcW w:type="dxa" w:w="3969"/>
           </w:tcPr>
           <w:p>
             <w:r>
@@ -214,17 +222,17 @@
         </w:tc>
         <w:tc>
           <w:tcPr>
-            <w:tcW w:type="dxa" w:w="1928"/>
+            <w:tcW w:type="dxa" w:w="2835"/>
           </w:tcPr>
           <w:p>
             <w:r>
-              <w:t>The class nobody wants to touch</w:t>
+              <w:t>Code smells make every change expensive, and today's tools only point at them</w:t>
             </w:r>
           </w:p>
         </w:tc>
         <w:tc>
           <w:tcPr>
-            <w:tcW w:type="dxa" w:w="4876"/>
+            <w:tcW w:type="dxa" w:w="3969"/>
           </w:tcPr>
           <w:p>
             <w:r>
@@ -266,17 +274,17 @@
         </w:tc>
         <w:tc>
           <w:tcPr>
-            <w:tcW w:type="dxa" w:w="1928"/>
+            <w:tcW w:type="dxa" w:w="2835"/>
           </w:tcPr>
           <w:p>
             <w:r>
-              <w:t>What we built: JavaSmell</w:t>
+              <w:t>JavaSmell measures 26 metrics once and answers with three approaches</w:t>
             </w:r>
           </w:p>
         </w:tc>
         <w:tc>
           <w:tcPr>
-            <w:tcW w:type="dxa" w:w="4876"/>
+            <w:tcW w:type="dxa" w:w="3969"/>
           </w:tcPr>
           <w:p>
             <w:r>
@@ -318,17 +326,17 @@
         </w:tc>
         <w:tc>
           <w:tcPr>
-            <w:tcW w:type="dxa" w:w="1928"/>
+            <w:tcW w:type="dxa" w:w="2835"/>
           </w:tcPr>
           <w:p>
             <w:r>
-              <w:t>Data and a fair test</w:t>
+              <w:t>Professional developers label the code; no model is tested on a project it saw</w:t>
             </w:r>
           </w:p>
         </w:tc>
         <w:tc>
           <w:tcPr>
-            <w:tcW w:type="dxa" w:w="4876"/>
+            <w:tcW w:type="dxa" w:w="3969"/>
           </w:tcPr>
           <w:p>
             <w:r>
@@ -370,17 +378,17 @@
         </w:tc>
         <w:tc>
           <w:tcPr>
-            <w:tcW w:type="dxa" w:w="1928"/>
+            <w:tcW w:type="dxa" w:w="2835"/>
           </w:tcPr>
           <w:p>
             <w:r>
-              <w:t>Rules vs. machine learning</w:t>
+              <w:t>Learned models beat the rules on all four smells</w:t>
             </w:r>
           </w:p>
         </w:tc>
         <w:tc>
           <w:tcPr>
-            <w:tcW w:type="dxa" w:w="4876"/>
+            <w:tcW w:type="dxa" w:w="3969"/>
           </w:tcPr>
           <w:p>
             <w:r>
@@ -422,17 +430,17 @@
         </w:tc>
         <w:tc>
           <w:tcPr>
-            <w:tcW w:type="dxa" w:w="1928"/>
+            <w:tcW w:type="dxa" w:w="2835"/>
           </w:tcPr>
           <w:p>
             <w:r>
-              <w:t>Why some smells stay hard</w:t>
+              <w:t>For Feature Envy, even two experts agree no better than chance</w:t>
             </w:r>
           </w:p>
         </w:tc>
         <w:tc>
           <w:tcPr>
-            <w:tcW w:type="dxa" w:w="4876"/>
+            <w:tcW w:type="dxa" w:w="3969"/>
           </w:tcPr>
           <w:p>
             <w:r>
@@ -474,17 +482,17 @@
         </w:tc>
         <w:tc>
           <w:tcPr>
-            <w:tcW w:type="dxa" w:w="1928"/>
+            <w:tcW w:type="dxa" w:w="2835"/>
           </w:tcPr>
           <w:p>
             <w:r>
-              <w:t>Automatic refactoring</w:t>
+              <w:t>The engine rewrites only what it can prove, and refuses the rest with a reason</w:t>
             </w:r>
           </w:p>
         </w:tc>
         <w:tc>
           <w:tcPr>
-            <w:tcW w:type="dxa" w:w="4876"/>
+            <w:tcW w:type="dxa" w:w="3969"/>
           </w:tcPr>
           <w:p>
             <w:r>
@@ -526,17 +534,17 @@
         </w:tc>
         <w:tc>
           <w:tcPr>
-            <w:tcW w:type="dxa" w:w="1928"/>
+            <w:tcW w:type="dxa" w:w="2835"/>
           </w:tcPr>
           <w:p>
             <w:r>
-              <w:t>Example from real code</w:t>
+              <w:t>Real code: the outer if becomes an early return</w:t>
             </w:r>
           </w:p>
         </w:tc>
         <w:tc>
           <w:tcPr>
-            <w:tcW w:type="dxa" w:w="4876"/>
+            <w:tcW w:type="dxa" w:w="3969"/>
           </w:tcPr>
           <w:p>
             <w:r>
@@ -578,7 +586,7 @@
         </w:tc>
         <w:tc>
           <w:tcPr>
-            <w:tcW w:type="dxa" w:w="1928"/>
+            <w:tcW w:type="dxa" w:w="2835"/>
           </w:tcPr>
           <w:p>
             <w:r>
@@ -588,7 +596,7 @@
         </w:tc>
         <w:tc>
           <w:tcPr>
-            <w:tcW w:type="dxa" w:w="4876"/>
+            <w:tcW w:type="dxa" w:w="3969"/>
           </w:tcPr>
           <w:p>
             <w:r>
@@ -709,7 +717,7 @@
         <w:pStyle w:val="ListBullet"/>
       </w:pPr>
       <w:r>
-        <w:t>Titulli i punimit, me shkronja të mëdha.</w:t>
+        <w:t>Sfond blu i errët: kështu duken vetëm sllajdi i parë dhe i fundit, që salla ta ndiejë fillimin dhe mbylljen.</w:t>
       </w:r>
     </w:p>
     <w:p>
@@ -717,7 +725,7 @@
         <w:pStyle w:val="ListBullet"/>
       </w:pPr>
       <w:r>
-        <w:t>Poshtë: emrat (Florent Latifi  ·  Altina Salihu), UBT dhe emri i konferencës.</w:t>
+        <w:t>Lart, me shkronja të vogla: emri i konferencës. Në mes: titulli i punimit.</w:t>
       </w:r>
     </w:p>
     <w:p>
@@ -725,7 +733,7 @@
         <w:pStyle w:val="ListBullet"/>
       </w:pPr>
       <w:r>
-        <w:t>Numri i sllajdit poshtë djathtas. Çdo sllajd e ka, që dikush të mund të thotë «te sllajdi 5…».</w:t>
+        <w:t>Poshtë titullit: emrat (Florent Latifi  ·  Altina Salihu) dhe UBT. Në fund: seanca dhe data.</w:t>
       </w:r>
     </w:p>
     <w:p>
@@ -858,7 +866,7 @@
         <w:pStyle w:val="Heading1"/>
       </w:pPr>
       <w:r>
-        <w:t>Sllajdi 2 · The class nobody wants to touch</w:t>
+        <w:t>Sllajdi 2 · Code smells make every change expensive, and today's tools only point at them</w:t>
       </w:r>
     </w:p>
     <w:p>
@@ -890,7 +898,7 @@
         <w:pStyle w:val="ListBullet"/>
       </w:pPr>
       <w:r>
-        <w:t>Titulli: «Klasa që askush nuk do ta prekë». Nëntitulli: erërat janë probleme të ndërtimit të kodit, jo gabime.</w:t>
+        <w:t>Titulli e thotë problemin në një fjali: erërat e bëjnë çdo ndryshim të shtrenjtë, dhe mjetet e sotme vetëm i tregojnë. Nëntitulli: janë probleme ndërtimi, jo gabime.</w:t>
       </w:r>
     </w:p>
     <w:p>
@@ -906,7 +914,7 @@
         <w:pStyle w:val="ListBullet"/>
       </w:pPr>
       <w:r>
-        <w:t>Me blu, tri pyetjet e kërkimit (RQ = research question). RQ1: sa të sakta janë rregullat e botuara? RQ2: a bën më mirë mësimi makinerik me të njëjtat metrika? RQ3: a mund të ndreqen automatikisht pa e prishur kompilimin?</w:t>
+        <w:t>Poshtë, tri karta: tri pyetjet e kërkimit (RQ = research question). RQ1: sa të sakta janë rregullat e botuara? RQ2: a bën më mirë mësimi makinerik me të njëjtat metrika? RQ3: a mund të ndreqen automatikisht pa e prishur kompilimin?</w:t>
       </w:r>
     </w:p>
     <w:p>
@@ -914,7 +922,15 @@
         <w:pStyle w:val="ListBullet"/>
       </w:pPr>
       <w:r>
-        <w:t>Këto tri pyetje janë skeleti i gjithë prezantimit: sllajdet 5 dhe 6 u përgjigjen RQ1 dhe RQ2, sllajdet 7 dhe 8 RQ3.</w:t>
+        <w:t>Në fund të çdo karte, një rreth me shkronjë: A (gri) rregullat, B (blu) mësimi makinerik, C (blu) motori. Janë të njëjtat shkronja që shfaqen te sllajdi 3.</w:t>
+      </w:r>
+    </w:p>
+    <w:p>
+      <w:pPr>
+        <w:pStyle w:val="ListBullet"/>
+      </w:pPr>
+      <w:r>
+        <w:t>Nga sllajdi 4 deri te 8, lart djathtas ka tri etiketa RQ1 · RQ2 · RQ3. Ajo me blu është pyetja për të cilën flet sllajdi: kjo është harta e prezantimit.</w:t>
       </w:r>
     </w:p>
     <w:p>
@@ -938,7 +954,7 @@
         <w:pStyle w:val="ListBullet"/>
       </w:pPr>
       <w:r>
-        <w:t>Te «So we asked three questions», trego listën blu dhe ndalu një sekondë te secila pyetje.</w:t>
+        <w:t>Te «So we asked three questions», trego tri kartat nga e majta në të djathtë dhe ndalu një sekondë te secila.</w:t>
       </w:r>
     </w:p>
     <w:p>
@@ -1296,7 +1312,7 @@
         <w:pStyle w:val="Heading1"/>
       </w:pPr>
       <w:r>
-        <w:t>Sllajdi 3 · What we built: JavaSmell</w:t>
+        <w:t>Sllajdi 3 · JavaSmell measures 26 metrics once and answers with three approaches</w:t>
       </w:r>
     </w:p>
     <w:p>
@@ -1328,7 +1344,7 @@
         <w:pStyle w:val="ListBullet"/>
       </w:pPr>
       <w:r>
-        <w:t>Majtas, tri kuti. A Rules: 8 rregulla nga literatura mbi 26 metrika. B Machine learning: modele të trajnuara mbi të njëjtat metrika. C Refactoring engine: rishkrime mbi pemën e sintaksës (AST), vetëm kur kushtet vërtetohen, pastaj kontroll me javac.</w:t>
+        <w:t>Majtas, rrjedha e mjetit nga lart poshtë: kodi Java → 26 metrika për çdo klasë e metodë → dy kuti krah për krah, A (8 rregulla të botuara) dhe B (mësimi makinerik) → erërat, secila me kushtet që e shkaktuan → C, motori që rishkruan vetëm atë që vërteton → kontrolli me javac dhe një patch, pa e prekur origjinalin.</w:t>
       </w:r>
     </w:p>
     <w:p>
@@ -1344,7 +1360,7 @@
         <w:pStyle w:val="ListBullet"/>
       </w:pPr>
       <w:r>
-        <w:t>Djathtas, një foto e ndërfaqes web gjatë analizës së jsoup-it (një librari e njohur Java për faqet HTML), në mënyrën me gjuhë të thjeshtë, shqip.</w:t>
+        <w:t>Djathtas, një copë e zmadhuar e ndërfaqes web gjatë analizës së jsoup-it (një librari e njohur Java për faqet HTML), shqip: dy gjetje, secila me kushtet e veta, p.sh. «Rreshtat e kodit të metodës: 53 (problem kur është mbi 30)».</w:t>
       </w:r>
     </w:p>
     <w:p>
@@ -1360,7 +1376,7 @@
         <w:pStyle w:val="ListBullet"/>
       </w:pPr>
       <w:r>
-        <w:t>Trego kutitë A, B dhe C me radhë, kur thua fjalinë për secilën.</w:t>
+        <w:t>Ndiqe rrjedhën me dorë nga lart poshtë: te «A uses…» kutia A, te «B trains…» kutia B, te «And C is a refactoring engine» kutia C.</w:t>
       </w:r>
     </w:p>
     <w:p>
@@ -1701,7 +1717,7 @@
         <w:pStyle w:val="Heading1"/>
       </w:pPr>
       <w:r>
-        <w:t>Sllajdi 4 · Data and a fair test</w:t>
+        <w:t>Sllajdi 4 · Professional developers label the code; no model is tested on a project it saw</w:t>
       </w:r>
     </w:p>
     <w:p>
@@ -1733,7 +1749,7 @@
         <w:pStyle w:val="ListBullet"/>
       </w:pPr>
       <w:r>
-        <w:t>Katër numra të mëdhenj: 9,046 mostra me etiketë (një mostër është një klasë ose një metodë që e ka vlerësuar një njeri), 512 projekte (repository), 4 erëra, 26 metrika.</w:t>
+        <w:t>Lart djathtas ndizen RQ1 dhe RQ2: ky sllajd tregon si u provuan rregullat dhe modelet.</w:t>
       </w:r>
     </w:p>
     <w:p>
@@ -1741,7 +1757,7 @@
         <w:pStyle w:val="ListBullet"/>
       </w:pPr>
       <w:r>
-        <w:t>Pika 1: etiketat vijnë nga MLCQ (Madeyski &amp; Lewowski, 2020), kod Java me burim të hapur i shqyrtuar nga 26 programues profesionistë.</w:t>
+        <w:t>Tre numra të mëdhenj: 9,046 mostra me etiketë (një mostër është një klasë ose një metodë që e ka vlerësuar një njeri), 512 projekte (repository) dhe 4 erëra.</w:t>
       </w:r>
     </w:p>
     <w:p>
@@ -1749,7 +1765,7 @@
         <w:pStyle w:val="ListBullet"/>
       </w:pPr>
       <w:r>
-        <w:t>Pika 2: ndarja sipas projektit. Modeli nuk provohet mbi projektin nga i cili mësoi.</w:t>
+        <w:t>Poshtë majtas, 5 kuti me katrorë: çdo kuti është një grup projektesh. Katër gri janë «train», ku modeli mëson; e pesta, blu, është «test», ku provohet. Një projekt ndodhet vetëm në një kuti.</w:t>
       </w:r>
     </w:p>
     <w:p>
@@ -1757,7 +1773,7 @@
         <w:pStyle w:val="ListBullet"/>
       </w:pPr>
       <w:r>
-        <w:t>Pika 3: nota kryesore është MCC, sepse shumica e mostrave janë të pastra.</w:t>
+        <w:t>Poshtë djathtas, kutia «Why MCC, not accuracy»: 92.8% me të kuqe është saktësia e një detektori që thotë gjithmonë «i pastër» te Feature Envy. MCC-ja e tij është 0.</w:t>
       </w:r>
     </w:p>
     <w:p>
@@ -1781,7 +1797,15 @@
         <w:pStyle w:val="ListBullet"/>
       </w:pPr>
       <w:r>
-        <w:t>Kur flet për ndarjen dhe për MCC, trego pikat 2 dhe 3.</w:t>
+        <w:t>Te «we grouped the data by repository», trego kutitë: «mëson nga këto katër, provohet te kjo».</w:t>
+      </w:r>
+    </w:p>
+    <w:p>
+      <w:pPr>
+        <w:pStyle w:val="ListBullet"/>
+      </w:pPr>
+      <w:r>
+        <w:t>Te «simple accuracy would look very good», trego numrin e kuq.</w:t>
       </w:r>
     </w:p>
     <w:p>
@@ -2132,7 +2156,7 @@
         <w:pStyle w:val="Heading1"/>
       </w:pPr>
       <w:r>
-        <w:t>Sllajdi 5 · Rules vs. machine learning</w:t>
+        <w:t>Sllajdi 5 · Learned models beat the rules on all four smells</w:t>
       </w:r>
     </w:p>
     <w:p>
@@ -2164,7 +2188,7 @@
         <w:pStyle w:val="ListBullet"/>
       </w:pPr>
       <w:r>
-        <w:t>Grafik me shtylla. Poshtë janë katër erërat. Për secilën ka dy shtylla krah për krah: gri janë rregullat e botuara (A), blu është modeli më i mirë (B).</w:t>
+        <w:t>Grafik me shtylla. Për çdo erë ka dy shtylla krah për krah: gri janë rregullat e botuara (A), blu është modeli më i mirë (B).</w:t>
       </w:r>
     </w:p>
     <w:p>
@@ -2188,7 +2212,15 @@
         <w:pStyle w:val="ListBullet"/>
       </w:pPr>
       <w:r>
-        <w:t>Poshtë grafikut dy pika: rregullat kapin vetëm 17–47% të rasteve; modelet janë më të mira te të katërta, me dallim të sigurt statistikisht te Blob, Data Class dhe Long Method (interval besimi 95% sipas projektit).</w:t>
+        <w:t>Nën emrin e çdo ere: «(significant)» do të thotë që fitorja e modelit është e sigurt statistikisht; «(could be chance)» do të thotë që mund të jetë rastësi.</w:t>
+      </w:r>
+    </w:p>
+    <w:p>
+      <w:pPr>
+        <w:pStyle w:val="ListBullet"/>
+      </w:pPr>
+      <w:r>
+        <w:t>Djathtas, dy numra: 17–47% me gri, sa nga erërat e vërteta kapin rregullat; 0.32–0.72 me blu, MCC-ja e modelit më të mirë.</w:t>
       </w:r>
     </w:p>
     <w:p>
@@ -2205,6 +2237,14 @@
       </w:pPr>
       <w:r>
         <w:t>Te «The gray bars… and the blue bars…», trego një shtyllë gri dhe një blu, që salla ta lidhë ngjyrën me kuptimin.</w:t>
+      </w:r>
+    </w:p>
+    <w:p>
+      <w:pPr>
+        <w:pStyle w:val="ListBullet"/>
+      </w:pPr>
+      <w:r>
+        <w:t>Te «they catch only 17 to 47 percent», trego numrin gri djathtas.</w:t>
       </w:r>
     </w:p>
     <w:p>
@@ -2545,7 +2585,7 @@
         <w:pStyle w:val="Heading1"/>
       </w:pPr>
       <w:r>
-        <w:t>Sllajdi 6 · Why some smells stay hard</w:t>
+        <w:t>Sllajdi 6 · For Feature Envy, even two experts agree no better than chance</w:t>
       </w:r>
     </w:p>
     <w:p>
@@ -2577,7 +2617,7 @@
         <w:pStyle w:val="ListBullet"/>
       </w:pPr>
       <w:r>
-        <w:t>Grafik me një shtyllë për çdo erë: sa pajtohen dy rishikues njerëzorë që panë të njëjtin kod, i matur me MCC.</w:t>
+        <w:t>Grafik me një shtyllë për çdo erë: sa pajtohen dy rishikues njerëzorë që panë të njëjtin kod, i matur me MCC. Vija e hollë horizontale është zero, pra hamendja.</w:t>
       </w:r>
     </w:p>
     <w:p>
@@ -2601,7 +2641,7 @@
         <w:pStyle w:val="ListBullet"/>
       </w:pPr>
       <w:r>
-        <w:t>Poshtë: kufiri nuk është vetëm algoritmi, por përkufizimi i erës.</w:t>
+        <w:t>Djathtas: i njëjti numër i madh me të kuqe, dhe fjalia kryesore e sllajdit me shkronja të trasha.</w:t>
       </w:r>
     </w:p>
     <w:p>
@@ -2625,7 +2665,7 @@
         <w:pStyle w:val="ListBullet"/>
       </w:pPr>
       <w:r>
-        <w:t>Fjalinë «If experts do not agree…» thuaje ngadalë, duke parë sallën: është mesazhi kryesor i pjesës së parë.</w:t>
+        <w:t>Fjalinë «If experts do not agree…» thuaje ngadalë, duke parë sallën: është mesazhi kryesor i pjesës së parë, dhe e ke të shkruar djathtas.</w:t>
       </w:r>
     </w:p>
     <w:p>
@@ -2951,7 +2991,7 @@
         <w:pStyle w:val="Heading1"/>
       </w:pPr>
       <w:r>
-        <w:t>Sllajdi 7 · Automatic refactoring</w:t>
+        <w:t>Sllajdi 7 · The engine rewrites only what it can prove, and refuses the rest with a reason</w:t>
       </w:r>
     </w:p>
     <w:p>
@@ -2983,7 +3023,7 @@
         <w:pStyle w:val="ListBullet"/>
       </w:pPr>
       <w:r>
-        <w:t>Katër numra. 15,800: vende ku mund të zbatohej një ndreqje (një «site» është një vend konkret në kod). 3,532: të rishkruara (22.4%). 64.8%: era u zhduk pas rishkrimit. 1.6%: shtuan një lloj të ri gabimi kompilimi, dhe këto nuk shkruhen kurrë.</w:t>
+        <w:t>Lart: 15,800 vende ku mund të zbatohej një ndreqje (një «site» është një vend konkret në kod).</w:t>
       </w:r>
     </w:p>
     <w:p>
@@ -2991,7 +3031,7 @@
         <w:pStyle w:val="ListBullet"/>
       </w:pPr>
       <w:r>
-        <w:t>Tri ndreqjet me fjalë të thjeshta. Extract Method: një pjesë e metodës së gjatë kalon në një metodë të re. Guard Clauses: if-i i madh që mbështjell gjithë metodën bëhet dalje e hershme. Introduce Parameter Object: shumë parametra mblidhen në një objekt.</w:t>
+        <w:t>Shiriti poshtë tij: pjesa blu janë 3,532 të rishkruarat (22.4%), pjesa gri janë 12,252 të refuzuarat (77.5%). Gjatësia e secilës pjese është sa pjesa e saj.</w:t>
       </w:r>
     </w:p>
     <w:p>
@@ -2999,7 +3039,15 @@
         <w:pStyle w:val="ListBullet"/>
       </w:pPr>
       <w:r>
-        <w:t>Pikat poshtë: tri ndreqjet; refuzimi është rezultat i saktë (77.5% u refuzuan, secila me arsye); rishikimi me dorë i 60 rishkrimeve: 62.9% të pranueshme (të peshuara).</w:t>
+        <w:t>Tri kartat «Of the 3,532 rewrites»: 64.8% e hoqën erën; 1.6% shtuan një lloj të ri gabimi kompilimi dhe nuk shkruhen kurrë; 62.9% ishin të pranueshme në rishikimin me dorë të 60 rishkrimeve.</w:t>
+      </w:r>
+    </w:p>
+    <w:p>
+      <w:pPr>
+        <w:pStyle w:val="ListBullet"/>
+      </w:pPr>
+      <w:r>
+        <w:t>Tri ndreqjet, në nëntitull. Extract Method: një pjesë e metodës së gjatë kalon në një metodë të re. Guard Clauses: if-i i madh që mbështjell gjithë metodën bëhet dalje e hershme. Introduce Parameter Object: shumë parametra mblidhen në një objekt.</w:t>
       </w:r>
     </w:p>
     <w:p>
@@ -3015,7 +3063,7 @@
         <w:pStyle w:val="ListBullet"/>
       </w:pPr>
       <w:r>
-        <w:t>Trego katër numrat me radhë, kur thua fjalinë për secilin.</w:t>
+        <w:t>Te «it found … sites and rewrote …», trego numrin e madh, pastaj pjesën blu të shiritit.</w:t>
       </w:r>
     </w:p>
     <w:p>
@@ -3023,7 +3071,15 @@
         <w:pStyle w:val="ListBullet"/>
       </w:pPr>
       <w:r>
-        <w:t>Te «For us, refusing is a correct result», trego pikën e dytë.</w:t>
+        <w:t>Te «The rest were refused», trego pjesën gri. Te «For us, refusing is a correct result», mos lëviz: thuaje duke parë sallën.</w:t>
+      </w:r>
+    </w:p>
+    <w:p>
+      <w:pPr>
+        <w:pStyle w:val="ListBullet"/>
+      </w:pPr>
+      <w:r>
+        <w:t>Te tri numrat e fundit, trego tri kartat me radhë.</w:t>
       </w:r>
     </w:p>
     <w:p>
@@ -3431,7 +3487,7 @@
         <w:pStyle w:val="Heading1"/>
       </w:pPr>
       <w:r>
-        <w:t>Sllajdi 8 · Example from real code</w:t>
+        <w:t>Sllajdi 8 · Real code: the outer if becomes an early return</w:t>
       </w:r>
     </w:p>
     <w:p>
@@ -3463,7 +3519,7 @@
         <w:pStyle w:val="ListBullet"/>
       </w:pPr>
       <w:r>
-        <w:t>Lart, «Before»: kodi origjinal nga Apache Geode, metoda checkForLimitedOrNoAccess. Rreshtat me të kuqe janë ata që ndryshojnë.</w:t>
+        <w:t>Lart, «Before»: kodi origjinal nga Apache Geode, metoda checkForLimitedOrNoAccess. Rreshtat në brez të kuq janë ata që ndryshojnë: if-i i jashtëm dhe kllapa e tij e fundit.</w:t>
       </w:r>
     </w:p>
     <w:p>
@@ -3471,7 +3527,7 @@
         <w:pStyle w:val="ListBullet"/>
       </w:pPr>
       <w:r>
-        <w:t>Poshtë, «After»: kodi pas rishkrimit. Rreshtat me të gjelbër janë të rinj: kushti me «!( … )» dhe «return;».</w:t>
+        <w:t>Poshtë, «After»: kodi pas rishkrimit. Rreshtat në brez të gjelbër janë të rinj: kushti me «!( … )» dhe «return;».</w:t>
       </w:r>
     </w:p>
     <w:p>
@@ -3479,7 +3535,7 @@
         <w:pStyle w:val="ListBullet"/>
       </w:pPr>
       <w:r>
-        <w:t>Komenti «// … unchanged lines» do të thotë që një pjesë e gjatë që nuk ndryshon është hequr nga sllajdi, që kodi të lexohet nga salla.</w:t>
+        <w:t>Komenti «/* … unchanged lines */» do të thotë që një pjesë e gjatë që nuk ndryshon është mbledhur në një rresht, që kodi të lexohet nga salla.</w:t>
       </w:r>
     </w:p>
     <w:p>
@@ -3487,7 +3543,7 @@
         <w:pStyle w:val="ListBullet"/>
       </w:pPr>
       <w:r>
-        <w:t>Djathtas, tri pika: kushti i jashtëm bëhet guard clause me dalje të hershme; pjesa tjetër ngjitet një nivel; e kaloi javac dhe u gjykua e pranueshme.</w:t>
+        <w:t>Djathtas, tri hapa me numër: kushti bëhet dalje e hershme; pjesa tjetër ngjitet një nivel; e kaloi javac dhe u gjykua e pranueshme.</w:t>
       </w:r>
     </w:p>
     <w:p>
@@ -3503,7 +3559,7 @@
         <w:pStyle w:val="ListBullet"/>
       </w:pPr>
       <w:r>
-        <w:t>Te «Before…», trego rreshtin e parë me if në kutinë lart.</w:t>
+        <w:t>Te «Before…», trego brezin e kuq lart.</w:t>
       </w:r>
     </w:p>
     <w:p>
@@ -3511,7 +3567,7 @@
         <w:pStyle w:val="ListBullet"/>
       </w:pPr>
       <w:r>
-        <w:t>Te «After…», trego «if (!( … )) { return; }» në kutinë poshtë.</w:t>
+        <w:t>Te «After…», trego brezin e gjelbër poshtë, pastaj hapat djathtas.</w:t>
       </w:r>
     </w:p>
     <w:p>
@@ -3769,6 +3825,14 @@
         <w:pStyle w:val="ListBullet"/>
       </w:pPr>
       <w:r>
+        <w:t>Sfond blu i errët, si sllajdi i parë: salla e kupton që po mbyll.</w:t>
+      </w:r>
+    </w:p>
+    <w:p>
+      <w:pPr>
+        <w:pStyle w:val="ListBullet"/>
+      </w:pPr>
+      <w:r>
         <w:t>Majtas, me të kuqe, «Limitations»: kompilohet ≠ sillet njësoj (testet e projekteve nuk u ekzekutuan); një bazë të dhënash, katër erëra, vetëm Java; modeli më i mirë u zgjodh mbi të njëjtat parashikime, ndaj është pak optimist.</w:t>
       </w:r>
     </w:p>
@@ -3777,7 +3841,7 @@
         <w:pStyle w:val="ListBullet"/>
       </w:pPr>
       <w:r>
-        <w:t>Djathtas, me blu, «Takeaways», mesazhet që merr salla me vete: kufijtë e mësuar i mundin pragjet fikse; automatizimi i sigurt është i ngushtë, por i matshëm; burim i hapur dhe i riprodhueshëm.</w:t>
+        <w:t>Djathtas, me blu të çelët, «Takeaways», mesazhet që merr salla me vete: kufijtë e mësuar i mundin pragjet fikse; automatizimi i sigurt është i ngushtë, por i matshëm; burim i hapur dhe i riprodhueshëm.</w:t>
       </w:r>
     </w:p>
     <w:p>
@@ -3785,7 +3849,7 @@
         <w:pStyle w:val="ListBullet"/>
       </w:pPr>
       <w:r>
-        <w:t>Poshtë: «Thank you! Questions?» dhe adresa e projektit në GitHub.</w:t>
+        <w:t>Poshtë: «Thank you · Questions?» dhe adresa e projektit në GitHub.</w:t>
       </w:r>
     </w:p>
     <w:p>

</xml_diff>

<commit_message>
Bëje prezantimin më të kuptueshëm për sallën
Sllajd i ri me katër erërat e vizatuara, shkallë e MCC-së, numrat «nga 100» dhe përgjigjet e tri pyetjeve.
</commit_message>
<xml_diff>
--- a/docs/konferenca/UBT2026_cka_te_flas.docx
+++ b/docs/konferenca/UBT2026_cka_te_flas.docx
@@ -75,7 +75,7 @@
         <w:pStyle w:val="ListBullet"/>
       </w:pPr>
       <w:r>
-        <w:t>Lart djathtas, nga sllajdi 4 te 8, etiketat RQ1 · RQ2 · RQ3 tregojnë për cilën pyetje flet sllajdi; ajo me blu është pyetja e tanishme. Nuk ke nevojë ta thuash: salla e sheh vetë.</w:t>
+        <w:t>Lart djathtas, nga sllajdi 5 te 9, etiketat Q1 · Q2 · Q3 tregojnë për cilën pyetje flet sllajdi; ajo me blu është pyetja e tanishme. Nuk ke nevojë ta thuash: salla e sheh vetë.</w:t>
       </w:r>
     </w:p>
     <w:p>
@@ -88,7 +88,7 @@
     </w:p>
     <w:p>
       <w:r>
-        <w:t>Prezantimi është një histori me tri pjesë: problemi (1–2), çka ndërtove dhe si e provove (3–4), çka gjete (5–8), dhe kufijtë (9). Nëse e kupton këtë tabelë, e di prezantimin.</w:t>
+        <w:t>Prezantimi është një histori me katër pjesë: problemi dhe erërat (1–3), çka ndërtove dhe si e provove (4–5), çka gjete (6–9), dhe përgjigjet me kufijtë (10). Nëse e kupton këtë tabelë, e di prezantimin.</w:t>
       </w:r>
     </w:p>
     <w:tbl>
@@ -278,6 +278,58 @@
           </w:tcPr>
           <w:p>
             <w:r>
+              <w:t>Four code smells, each a different design problem</w:t>
+            </w:r>
+          </w:p>
+        </w:tc>
+        <w:tc>
+          <w:tcPr>
+            <w:tcW w:type="dxa" w:w="3969"/>
+          </w:tcPr>
+          <w:p>
+            <w:r>
+              <w:t>Katër erërat që mat studimi, të vizatuara: salla e sheh çka është secila para se të dëgjojë një numër.</w:t>
+            </w:r>
+          </w:p>
+        </w:tc>
+        <w:tc>
+          <w:tcPr>
+            <w:tcW w:type="dxa" w:w="1020"/>
+          </w:tcPr>
+          <w:p>
+            <w:r>
+              <w:t>1:55</w:t>
+            </w:r>
+          </w:p>
+        </w:tc>
+        <w:tc>
+          <w:tcPr>
+            <w:tcW w:type="dxa" w:w="1020"/>
+          </w:tcPr>
+          <w:p>
+            <w:r>
+              <w:t>1:55</w:t>
+            </w:r>
+          </w:p>
+        </w:tc>
+      </w:tr>
+      <w:tr>
+        <w:tc>
+          <w:tcPr>
+            <w:tcW w:type="dxa" w:w="454"/>
+          </w:tcPr>
+          <w:p>
+            <w:r>
+              <w:t>4</w:t>
+            </w:r>
+          </w:p>
+        </w:tc>
+        <w:tc>
+          <w:tcPr>
+            <w:tcW w:type="dxa" w:w="2835"/>
+          </w:tcPr>
+          <w:p>
+            <w:r>
               <w:t>JavaSmell measures 26 metrics once and answers with three approaches</w:t>
             </w:r>
           </w:p>
@@ -298,7 +350,7 @@
           </w:tcPr>
           <w:p>
             <w:r>
-              <w:t>2:25</w:t>
+              <w:t>2:51</w:t>
             </w:r>
           </w:p>
         </w:tc>
@@ -308,7 +360,7 @@
           </w:tcPr>
           <w:p>
             <w:r>
-              <w:t>2:37</w:t>
+              <w:t>3:03</w:t>
             </w:r>
           </w:p>
         </w:tc>
@@ -320,7 +372,7 @@
           </w:tcPr>
           <w:p>
             <w:r>
-              <w:t>4</w:t>
+              <w:t>5</w:t>
             </w:r>
           </w:p>
         </w:tc>
@@ -350,7 +402,7 @@
           </w:tcPr>
           <w:p>
             <w:r>
-              <w:t>3:18</w:t>
+              <w:t>3:44</w:t>
             </w:r>
           </w:p>
         </w:tc>
@@ -360,7 +412,7 @@
           </w:tcPr>
           <w:p>
             <w:r>
-              <w:t>3:52</w:t>
+              <w:t>3:56</w:t>
             </w:r>
           </w:p>
         </w:tc>
@@ -372,7 +424,7 @@
           </w:tcPr>
           <w:p>
             <w:r>
-              <w:t>5</w:t>
+              <w:t>6</w:t>
             </w:r>
           </w:p>
         </w:tc>
@@ -402,7 +454,7 @@
           </w:tcPr>
           <w:p>
             <w:r>
-              <w:t>4:06</w:t>
+              <w:t>4:41</w:t>
             </w:r>
           </w:p>
         </w:tc>
@@ -412,7 +464,7 @@
           </w:tcPr>
           <w:p>
             <w:r>
-              <w:t>4:56</w:t>
+              <w:t>5:09</w:t>
             </w:r>
           </w:p>
         </w:tc>
@@ -424,7 +476,7 @@
           </w:tcPr>
           <w:p>
             <w:r>
-              <w:t>6</w:t>
+              <w:t>7</w:t>
             </w:r>
           </w:p>
         </w:tc>
@@ -454,7 +506,7 @@
           </w:tcPr>
           <w:p>
             <w:r>
-              <w:t>4:48</w:t>
+              <w:t>5:23</w:t>
             </w:r>
           </w:p>
         </w:tc>
@@ -464,7 +516,7 @@
           </w:tcPr>
           <w:p>
             <w:r>
-              <w:t>5:52</w:t>
+              <w:t>6:05</w:t>
             </w:r>
           </w:p>
         </w:tc>
@@ -476,7 +528,7 @@
           </w:tcPr>
           <w:p>
             <w:r>
-              <w:t>7</w:t>
+              <w:t>8</w:t>
             </w:r>
           </w:p>
         </w:tc>
@@ -506,7 +558,7 @@
           </w:tcPr>
           <w:p>
             <w:r>
-              <w:t>5:45</w:t>
+              <w:t>6:20</w:t>
             </w:r>
           </w:p>
         </w:tc>
@@ -516,7 +568,7 @@
           </w:tcPr>
           <w:p>
             <w:r>
-              <w:t>7:26</w:t>
+              <w:t>7:39</w:t>
             </w:r>
           </w:p>
         </w:tc>
@@ -528,7 +580,7 @@
           </w:tcPr>
           <w:p>
             <w:r>
-              <w:t>8</w:t>
+              <w:t>9</w:t>
             </w:r>
           </w:p>
         </w:tc>
@@ -558,7 +610,7 @@
           </w:tcPr>
           <w:p>
             <w:r>
-              <w:t>6:18</w:t>
+              <w:t>6:53</w:t>
             </w:r>
           </w:p>
         </w:tc>
@@ -568,7 +620,7 @@
           </w:tcPr>
           <w:p>
             <w:r>
-              <w:t>8:19</w:t>
+              <w:t>8:32</w:t>
             </w:r>
           </w:p>
         </w:tc>
@@ -580,7 +632,7 @@
           </w:tcPr>
           <w:p>
             <w:r>
-              <w:t>9</w:t>
+              <w:t>10</w:t>
             </w:r>
           </w:p>
         </w:tc>
@@ -590,7 +642,7 @@
           </w:tcPr>
           <w:p>
             <w:r>
-              <w:t>Limitations and takeaways</w:t>
+              <w:t>Three answers, and their limits</w:t>
             </w:r>
           </w:p>
         </w:tc>
@@ -610,7 +662,7 @@
           </w:tcPr>
           <w:p>
             <w:r>
-              <w:t>7:03</w:t>
+              <w:t>7:38</w:t>
             </w:r>
           </w:p>
         </w:tc>
@@ -620,7 +672,7 @@
           </w:tcPr>
           <w:p>
             <w:r>
-              <w:t>9:26</w:t>
+              <w:t>9:39</w:t>
             </w:r>
           </w:p>
         </w:tc>
@@ -656,7 +708,7 @@
         <w:pStyle w:val="ListBullet"/>
       </w:pPr>
       <w:r>
-        <w:t>Për të hapur një sllajd rezervë, shtyp numrin e tij dhe Enter (p.sh. 1, 4, Enter për sllajdin 14). Për t'u kthyer te mbyllja: 9, Enter.</w:t>
+        <w:t>Për të hapur një sllajd rezervë, shtyp numrin e tij dhe Enter (p.sh. 1, 5, Enter për sllajdin 15). Për t'u kthyer te mbyllja: 10, Enter.</w:t>
       </w:r>
     </w:p>
     <w:p>
@@ -914,7 +966,7 @@
         <w:pStyle w:val="ListBullet"/>
       </w:pPr>
       <w:r>
-        <w:t>Poshtë, tri karta: tri pyetjet e kërkimit (RQ = research question). RQ1: sa të sakta janë rregullat e botuara? RQ2: a bën më mirë mësimi makinerik me të njëjtat metrika? RQ3: a mund të ndreqen automatikisht pa e prishur kompilimin?</w:t>
+        <w:t>Poshtë, tri karta: tri pyetjet e kërkimit, Q1, Q2 dhe Q3. Q1: sa të sakta janë rregullat e botuara? Q2: a bën më mirë mësimi makinerik me të njëjtat metrika? Q3: a mund të ndreqen automatikisht pa e prishur kompilimin?</w:t>
       </w:r>
     </w:p>
     <w:p>
@@ -922,7 +974,7 @@
         <w:pStyle w:val="ListBullet"/>
       </w:pPr>
       <w:r>
-        <w:t>Në fund të çdo karte, një rreth me shkronjë: A (gri) rregullat, B (blu) mësimi makinerik, C (blu) motori. Janë të njëjtat shkronja që shfaqen te sllajdi 3.</w:t>
+        <w:t>Në fund të çdo karte, një rreth me shkronjë: A (gri) rregullat, B (blu) mësimi makinerik, C (blu) motori. Janë të njëjtat shkronja që shfaqen te sllajdi 4.</w:t>
       </w:r>
     </w:p>
     <w:p>
@@ -930,7 +982,7 @@
         <w:pStyle w:val="ListBullet"/>
       </w:pPr>
       <w:r>
-        <w:t>Nga sllajdi 4 deri te 8, lart djathtas ka tri etiketa RQ1 · RQ2 · RQ3. Ajo me blu është pyetja për të cilën flet sllajdi: kjo është harta e prezantimit.</w:t>
+        <w:t>Nga sllajdi 5 deri te 9, lart djathtas ka tri etiketa Q1 · Q2 · Q3. Ajo me blu është pyetja për të cilën flet sllajdi, dhe poshtë tyre shkruan çka bën sllajdi me të, p.sh. «answers Q1 · Q2»: kjo është harta e prezantimit.</w:t>
       </w:r>
     </w:p>
     <w:p>
@@ -1312,7 +1364,7 @@
         <w:pStyle w:val="Heading1"/>
       </w:pPr>
       <w:r>
-        <w:t>Sllajdi 3 · JavaSmell measures 26 metrics once and answers with three approaches</w:t>
+        <w:t>Sllajdi 3 · Four code smells, each a different design problem</w:t>
       </w:r>
     </w:p>
     <w:p>
@@ -1323,12 +1375,12 @@
         <w:t xml:space="preserve">Mesazhi: </w:t>
       </w:r>
       <w:r>
-        <w:t>Një mjet, 26 metrika, tri qasje: A rregulla, B modele, C një motor që ndreq dhe çdo ndreqje e kontrollon me javac.</w:t>
-      </w:r>
-    </w:p>
-    <w:p>
-      <w:r>
-        <w:t>Koha: rreth 55 sekonda në versionin e shkurtër, 67 në atë 9-minutësh.</w:t>
+        <w:t>Katër erërat që mat studimi, të vizatuara: salla e sheh çka është secila para se të dëgjojë një numër.</w:t>
+      </w:r>
+    </w:p>
+    <w:p>
+      <w:r>
+        <w:t>Koha: rreth 26 sekonda në versionin e shkurtër, 26 në atë 9-minutësh.</w:t>
       </w:r>
     </w:p>
     <w:p>
@@ -1344,7 +1396,7 @@
         <w:pStyle w:val="ListBullet"/>
       </w:pPr>
       <w:r>
-        <w:t>Majtas, rrjedha e mjetit nga lart poshtë: kodi Java → 26 metrika për çdo klasë e metodë → dy kuti krah për krah, A (8 rregulla të botuara) dhe B (mësimi makinerik) → erërat, secila me kushtet që e shkaktuan → C, motori që rishkruan vetëm atë që vërteton → kontrolli me javac dhe një patch, pa e prekur origjinalin.</w:t>
+        <w:t>Katër karta, një për çdo erë. Në secilën: një vizatim, emri dhe një fjali që e përkufizon.</w:t>
       </w:r>
     </w:p>
     <w:p>
@@ -1352,7 +1404,7 @@
         <w:pStyle w:val="ListBullet"/>
       </w:pPr>
       <w:r>
-        <w:t>AST është pema e sintaksës: kodi i kthyer në pemë, si analiza gramatikore e një fjalie. javac është kompajleri i Java-s: programi që e kthen kodin në program të ekzekutueshëm dhe tregon gabimet.</w:t>
+        <w:t>Si lexohen vizatimet: kutia është një klasë, vija blu një metodë, pika gri një fushë (një e dhënë). Kjo shkruhet edhe poshtë kartave.</w:t>
       </w:r>
     </w:p>
     <w:p>
@@ -1360,7 +1412,15 @@
         <w:pStyle w:val="ListBullet"/>
       </w:pPr>
       <w:r>
-        <w:t>Djathtas, një copë e zmadhuar e ndërfaqes web gjatë analizës së jsoup-it (një librari e njohur Java për faqet HTML), shqip: dy gjetje, secila me kushtet e veta, p.sh. «Rreshtat e kodit të metodës: 53 (problem kur është mbi 30)».</w:t>
+        <w:t>Blob: një kuti e madhe plot metoda, që merr të dhëna edhe nga dy klasa të vogla. Data Class: një kuti vetëm me fusha, dhe një klasë tjetër me metodën që punon me to. Long Method: një kolonë e gjatë rreshtash kodi. Feature Envy: një metodë në klasën e vet («own class») që zgjatet me tri vija te fushat e një klase tjetër.</w:t>
+      </w:r>
+    </w:p>
+    <w:p>
+      <w:pPr>
+        <w:pStyle w:val="ListBullet"/>
+      </w:pPr>
+      <w:r>
+        <w:t>Nëntitulli: të katërat janë të etiketuara nga programues profesionistë në MLCQ.</w:t>
       </w:r>
     </w:p>
     <w:p>
@@ -1376,7 +1436,7 @@
         <w:pStyle w:val="ListBullet"/>
       </w:pPr>
       <w:r>
-        <w:t>Ndiqe rrjedhën me dorë nga lart poshtë: te «A uses…» kutia A, te «B trains…» kutia B, te «And C is a refactoring engine» kutia C.</w:t>
+        <w:t>Trego kartat me radhë, nga e majta në të djathtë, kur thua emrin e secilës.</w:t>
       </w:r>
     </w:p>
     <w:p>
@@ -1384,7 +1444,7 @@
         <w:pStyle w:val="ListBullet"/>
       </w:pPr>
       <w:r>
-        <w:t>Te «On the right you can see the web interface», trego foton djathtas.</w:t>
+        <w:t>Te Feature Envy, ndiq me gisht vijat blu nga «own class» te «other class».</w:t>
       </w:r>
     </w:p>
     <w:p>
@@ -1403,7 +1463,237 @@
         <w:rPr>
           <w:sz w:val="24"/>
         </w:rPr>
-        <w:t>To answer them, I built a tool called JavaSmell.</w:t>
+        <w:t>This study looks at four of them.</w:t>
+      </w:r>
+    </w:p>
+    <w:p>
+      <w:pPr>
+        <w:spacing w:after="160"/>
+        <w:ind w:left="360"/>
+      </w:pPr>
+      <w:r>
+        <w:rPr>
+          <w:i/>
+          <w:color w:val="4C5560"/>
+          <w:sz w:val="20"/>
+        </w:rPr>
+        <w:t>Ky studim shqyrton katër prej tyre.</w:t>
+      </w:r>
+    </w:p>
+    <w:p>
+      <w:pPr>
+        <w:spacing w:after="0"/>
+      </w:pPr>
+      <w:r>
+        <w:rPr>
+          <w:sz w:val="24"/>
+        </w:rPr>
+        <w:t>Blob is a class that does too much.</w:t>
+      </w:r>
+    </w:p>
+    <w:p>
+      <w:pPr>
+        <w:spacing w:after="160"/>
+        <w:ind w:left="360"/>
+      </w:pPr>
+      <w:r>
+        <w:rPr>
+          <w:i/>
+          <w:color w:val="4C5560"/>
+          <w:sz w:val="20"/>
+        </w:rPr>
+        <w:t>Blob është një klasë që bën shumë gjëra.</w:t>
+      </w:r>
+    </w:p>
+    <w:p>
+      <w:pPr>
+        <w:spacing w:after="0"/>
+      </w:pPr>
+      <w:r>
+        <w:rPr>
+          <w:sz w:val="24"/>
+        </w:rPr>
+        <w:t>Data Class only holds data and has almost no behavior.</w:t>
+      </w:r>
+    </w:p>
+    <w:p>
+      <w:pPr>
+        <w:spacing w:after="160"/>
+        <w:ind w:left="360"/>
+      </w:pPr>
+      <w:r>
+        <w:rPr>
+          <w:i/>
+          <w:color w:val="4C5560"/>
+          <w:sz w:val="20"/>
+        </w:rPr>
+        <w:t>Data Class vetëm mban të dhëna dhe nuk bën pothuajse asgjë me to.</w:t>
+      </w:r>
+    </w:p>
+    <w:p>
+      <w:pPr>
+        <w:spacing w:after="0"/>
+      </w:pPr>
+      <w:r>
+        <w:rPr>
+          <w:sz w:val="24"/>
+        </w:rPr>
+        <w:t>Long Method is a method that has grown too long, and Feature Envy is a method that uses another class more than its own.</w:t>
+      </w:r>
+    </w:p>
+    <w:p>
+      <w:pPr>
+        <w:spacing w:after="160"/>
+        <w:ind w:left="360"/>
+      </w:pPr>
+      <w:r>
+        <w:rPr>
+          <w:i/>
+          <w:color w:val="4C5560"/>
+          <w:sz w:val="20"/>
+        </w:rPr>
+        <w:t>Long Method është një metodë që është zgjatur shumë, dhe Feature Envy është një metodë që përdor një klasë tjetër më shumë se klasën e vet.</w:t>
+      </w:r>
+    </w:p>
+    <w:p>
+      <w:pPr>
+        <w:pStyle w:val="Heading2"/>
+      </w:pPr>
+      <w:r>
+        <w:t>Nëse të ngec mendja</w:t>
+      </w:r>
+    </w:p>
+    <w:p>
+      <w:r>
+        <w:t>Blob bën shumë · Data Class vetëm të dhëna · Long Method e gjatë · Feature Envy te klasa tjetër</w:t>
+      </w:r>
+    </w:p>
+    <w:p>
+      <w:pPr>
+        <w:pStyle w:val="Heading2"/>
+      </w:pPr>
+      <w:r>
+        <w:t>Nëse të pyesin për këtë sllajd</w:t>
+      </w:r>
+    </w:p>
+    <w:p>
+      <w:pPr>
+        <w:spacing w:after="0"/>
+      </w:pPr>
+      <w:r>
+        <w:rPr>
+          <w:b/>
+        </w:rPr>
+        <w:t>Pse vetëm këto katër?</w:t>
+      </w:r>
+    </w:p>
+    <w:p>
+      <w:r>
+        <w:t>Sepse vetëm për to ka etiketa nga programues profesionistë në MLCQ. Mjeti gjen tetë erëra, por të tjerat nuk mund të krahasohen me njerëzit.</w:t>
+      </w:r>
+    </w:p>
+    <w:p>
+      <w:r>
+        <w:br w:type="page"/>
+      </w:r>
+    </w:p>
+    <w:p>
+      <w:pPr>
+        <w:pStyle w:val="Heading1"/>
+      </w:pPr>
+      <w:r>
+        <w:t>Sllajdi 4 · JavaSmell measures 26 metrics once and answers with three approaches</w:t>
+      </w:r>
+    </w:p>
+    <w:p>
+      <w:r>
+        <w:rPr>
+          <w:b/>
+        </w:rPr>
+        <w:t xml:space="preserve">Mesazhi: </w:t>
+      </w:r>
+      <w:r>
+        <w:t>Një mjet, 26 metrika, tri qasje: A rregulla, B modele, C një motor që ndreq dhe çdo ndreqje e kontrollon me javac.</w:t>
+      </w:r>
+    </w:p>
+    <w:p>
+      <w:r>
+        <w:t>Koha: rreth 56 sekonda në versionin e shkurtër, 68 në atë 9-minutësh.</w:t>
+      </w:r>
+    </w:p>
+    <w:p>
+      <w:pPr>
+        <w:pStyle w:val="Heading2"/>
+      </w:pPr>
+      <w:r>
+        <w:t>Çka shihet në sllajd</w:t>
+      </w:r>
+    </w:p>
+    <w:p>
+      <w:pPr>
+        <w:pStyle w:val="ListBullet"/>
+      </w:pPr>
+      <w:r>
+        <w:t>Majtas, rrjedha e mjetit nga lart poshtë: kodi Java → 26 metrika për çdo klasë e metodë → dy kuti krah për krah, A (8 rregulla të botuara) dhe B (mësimi makinerik) → erërat, secila me kushtet që e shkaktuan → C, motori që rishkruan vetëm atë që vërteton → kontrolli me javac dhe një patch, pa e prekur origjinalin.</w:t>
+      </w:r>
+    </w:p>
+    <w:p>
+      <w:pPr>
+        <w:pStyle w:val="ListBullet"/>
+      </w:pPr>
+      <w:r>
+        <w:t>AST është pema e sintaksës: kodi i kthyer në pemë, si analiza gramatikore e një fjalie. javac është kompajleri i Java-s: programi që e kthen kodin në program të ekzekutueshëm dhe tregon gabimet.</w:t>
+      </w:r>
+    </w:p>
+    <w:p>
+      <w:pPr>
+        <w:pStyle w:val="ListBullet"/>
+      </w:pPr>
+      <w:r>
+        <w:t>Djathtas, një copë e zmadhuar e ndërfaqes web gjatë analizës së jsoup-it (një librari e njohur Java për faqet HTML), shqip: dy gjetje, secila me kushtet e veta, p.sh. «Rreshtat e kodit të metodës: 53 (problem kur është mbi 30)».</w:t>
+      </w:r>
+    </w:p>
+    <w:p>
+      <w:pPr>
+        <w:pStyle w:val="Heading2"/>
+      </w:pPr>
+      <w:r>
+        <w:t>Ku të tregosh</w:t>
+      </w:r>
+    </w:p>
+    <w:p>
+      <w:pPr>
+        <w:pStyle w:val="ListBullet"/>
+      </w:pPr>
+      <w:r>
+        <w:t>Ndiqe rrjedhën me dorë nga lart poshtë: te «A uses…» kutia A, te «B trains…» kutia B, te «And C is a refactoring engine» kutia C.</w:t>
+      </w:r>
+    </w:p>
+    <w:p>
+      <w:pPr>
+        <w:pStyle w:val="ListBullet"/>
+      </w:pPr>
+      <w:r>
+        <w:t>Te «On the right you can see the web interface», trego foton djathtas.</w:t>
+      </w:r>
+    </w:p>
+    <w:p>
+      <w:pPr>
+        <w:pStyle w:val="Heading2"/>
+      </w:pPr>
+      <w:r>
+        <w:t>Çka thua</w:t>
+      </w:r>
+    </w:p>
+    <w:p>
+      <w:pPr>
+        <w:spacing w:after="0"/>
+      </w:pPr>
+      <w:r>
+        <w:rPr>
+          <w:sz w:val="24"/>
+        </w:rPr>
+        <w:t>To answer these questions, I built a tool called JavaSmell.</w:t>
       </w:r>
     </w:p>
     <w:p>
@@ -1717,7 +2007,7 @@
         <w:pStyle w:val="Heading1"/>
       </w:pPr>
       <w:r>
-        <w:t>Sllajdi 4 · Professional developers label the code; no model is tested on a project it saw</w:t>
+        <w:t>Sllajdi 5 · Professional developers label the code; no model is tested on a project it saw</w:t>
       </w:r>
     </w:p>
     <w:p>
@@ -1733,7 +2023,7 @@
     </w:p>
     <w:p>
       <w:r>
-        <w:t>Koha: rreth 53 sekonda në versionin e shkurtër, 75 në atë 9-minutësh.</w:t>
+        <w:t>Koha: rreth 53 sekonda në versionin e shkurtër, 53 në atë 9-minutësh.</w:t>
       </w:r>
     </w:p>
     <w:p>
@@ -1749,7 +2039,7 @@
         <w:pStyle w:val="ListBullet"/>
       </w:pPr>
       <w:r>
-        <w:t>Lart djathtas ndizen RQ1 dhe RQ2: ky sllajd tregon si u provuan rregullat dhe modelet.</w:t>
+        <w:t>Lart djathtas ndizen Q1 dhe Q2, me «testing» poshtë tyre: ky sllajd tregon si u provuan rregullat dhe modelet.</w:t>
       </w:r>
     </w:p>
     <w:p>
@@ -1757,7 +2047,7 @@
         <w:pStyle w:val="ListBullet"/>
       </w:pPr>
       <w:r>
-        <w:t>Tre numra të mëdhenj: 9,046 mostra me etiketë (një mostër është një klasë ose një metodë që e ka vlerësuar një njeri), 512 projekte (repository) dhe 4 erëra.</w:t>
+        <w:t>Dy numra: 9,046 copa kodi (klasa ose metoda) të gjykuara nga programues profesionistë, dhe 512 projektet nga vijnë.</w:t>
       </w:r>
     </w:p>
     <w:p>
@@ -1765,7 +2055,7 @@
         <w:pStyle w:val="ListBullet"/>
       </w:pPr>
       <w:r>
-        <w:t>Poshtë majtas, 5 kuti me katrorë: çdo kuti është një grup projektesh. Katër gri janë «train», ku modeli mëson; e pesta, blu, është «test», ku provohet. Një projekt ndodhet vetëm në një kuti.</w:t>
+        <w:t>Poshtë majtas, 5 kuti me katrorë: çdo kuti është një grup projektesh. Katër gri janë «learn», ku modeli mëson; e pesta, blu, është «test», ku provohet mbi projekte që nuk i ka parë. Një projekt ndodhet vetëm në një kuti.</w:t>
       </w:r>
     </w:p>
     <w:p>
@@ -1773,7 +2063,7 @@
         <w:pStyle w:val="ListBullet"/>
       </w:pPr>
       <w:r>
-        <w:t>Poshtë djathtas, kutia «Why MCC, not accuracy»: 92.8% me të kuqe është saktësia e një detektori që thotë gjithmonë «i pastër» te Feature Envy. MCC-ja e tij është 0.</w:t>
+        <w:t>Poshtë djathtas, kutia «Why the score is MCC, not accuracy»: 92.8% me të kuqe është saktësia e një detektori që thotë gjithmonë «i pastër» te Feature Envy. MCC-ja e tij është 0, sa hamendja.</w:t>
       </w:r>
     </w:p>
     <w:p>
@@ -1897,108 +2187,6 @@
       </w:pPr>
       <w:r>
         <w:rPr>
-          <w:b/>
-          <w:color w:val="2F6F45"/>
-        </w:rPr>
-        <w:t xml:space="preserve">+ </w:t>
-      </w:r>
-      <w:r>
-        <w:rPr>
-          <w:i/>
-          <w:color w:val="2F6F45"/>
-          <w:sz w:val="24"/>
-        </w:rPr>
-        <w:t>Blob is a class that does too much.</w:t>
-      </w:r>
-    </w:p>
-    <w:p>
-      <w:pPr>
-        <w:spacing w:after="160"/>
-        <w:ind w:left="360"/>
-      </w:pPr>
-      <w:r>
-        <w:rPr>
-          <w:i/>
-          <w:color w:val="4C5560"/>
-          <w:sz w:val="20"/>
-        </w:rPr>
-        <w:t>Blob është një klasë që bën shumë gjëra.</w:t>
-      </w:r>
-    </w:p>
-    <w:p>
-      <w:pPr>
-        <w:spacing w:after="0"/>
-      </w:pPr>
-      <w:r>
-        <w:rPr>
-          <w:b/>
-          <w:color w:val="2F6F45"/>
-        </w:rPr>
-        <w:t xml:space="preserve">+ </w:t>
-      </w:r>
-      <w:r>
-        <w:rPr>
-          <w:i/>
-          <w:color w:val="2F6F45"/>
-          <w:sz w:val="24"/>
-        </w:rPr>
-        <w:t>Data Class only holds data and has almost no behavior.</w:t>
-      </w:r>
-    </w:p>
-    <w:p>
-      <w:pPr>
-        <w:spacing w:after="160"/>
-        <w:ind w:left="360"/>
-      </w:pPr>
-      <w:r>
-        <w:rPr>
-          <w:i/>
-          <w:color w:val="4C5560"/>
-          <w:sz w:val="20"/>
-        </w:rPr>
-        <w:t>Data Class vetëm mban të dhëna dhe nuk bën pothuajse asgjë me to.</w:t>
-      </w:r>
-    </w:p>
-    <w:p>
-      <w:pPr>
-        <w:spacing w:after="0"/>
-      </w:pPr>
-      <w:r>
-        <w:rPr>
-          <w:b/>
-          <w:color w:val="2F6F45"/>
-        </w:rPr>
-        <w:t xml:space="preserve">+ </w:t>
-      </w:r>
-      <w:r>
-        <w:rPr>
-          <w:i/>
-          <w:color w:val="2F6F45"/>
-          <w:sz w:val="24"/>
-        </w:rPr>
-        <w:t>Long Method is a method that has grown too long, and Feature Envy is a method that uses another class more than its own.</w:t>
-      </w:r>
-    </w:p>
-    <w:p>
-      <w:pPr>
-        <w:spacing w:after="160"/>
-        <w:ind w:left="360"/>
-      </w:pPr>
-      <w:r>
-        <w:rPr>
-          <w:i/>
-          <w:color w:val="4C5560"/>
-          <w:sz w:val="20"/>
-        </w:rPr>
-        <w:t>Long Method është një metodë që është zgjatur shumë, dhe Feature Envy është një metodë që përdor një klasë tjetër më shumë se klasën e vet.</w:t>
-      </w:r>
-    </w:p>
-    <w:p>
-      <w:pPr>
-        <w:spacing w:after="0"/>
-      </w:pPr>
-      <w:r>
-        <w:rPr>
           <w:sz w:val="24"/>
         </w:rPr>
         <w:t>One important detail is how we split the data.</w:t>
@@ -2156,7 +2344,7 @@
         <w:pStyle w:val="Heading1"/>
       </w:pPr>
       <w:r>
-        <w:t>Sllajdi 5 · Learned models beat the rules on all four smells</w:t>
+        <w:t>Sllajdi 6 · Learned models beat the rules on all four smells</w:t>
       </w:r>
     </w:p>
     <w:p>
@@ -2172,7 +2360,7 @@
     </w:p>
     <w:p>
       <w:r>
-        <w:t>Koha: rreth 48 sekonda në versionin e shkurtër, 65 në atë 9-minutësh.</w:t>
+        <w:t>Koha: rreth 57 sekonda në versionin e shkurtër, 74 në atë 9-minutësh.</w:t>
       </w:r>
     </w:p>
     <w:p>
@@ -2220,7 +2408,15 @@
         <w:pStyle w:val="ListBullet"/>
       </w:pPr>
       <w:r>
-        <w:t>Djathtas, dy numra: 17–47% me gri, sa nga erërat e vërteta kapin rregullat; 0.32–0.72 me blu, MCC-ja e modelit më të mirë.</w:t>
+        <w:t>Djathtas lart, «How to read MCC»: një vijë nga «0 = guessing» te «1 = perfect». E njëjta shkallë del edhe te sllajdi tjetër.</w:t>
+      </w:r>
+    </w:p>
+    <w:p>
+      <w:pPr>
+        <w:pStyle w:val="ListBullet"/>
+      </w:pPr>
+      <w:r>
+        <w:t>Poshtë saj, «Out of 100 real smells»: rregullat gjejnë 17–47 (gri), modelet 30–83 (blu), dhe çmimi: zakonisht më shumë alarme të rreme.</w:t>
       </w:r>
     </w:p>
     <w:p>
@@ -2244,7 +2440,7 @@
         <w:pStyle w:val="ListBullet"/>
       </w:pPr>
       <w:r>
-        <w:t>Te «they catch only 17 to 47 percent», trego numrin gri djathtas.</w:t>
+        <w:t>Te «they catch only 17 to 47 percent», trego numrin gri djathtas; te «Out of every 100 smells», numrin blu poshtë tij.</w:t>
       </w:r>
     </w:p>
     <w:p>
@@ -2371,6 +2567,31 @@
         <w:rPr>
           <w:sz w:val="24"/>
         </w:rPr>
+        <w:t>Out of every 100 smells, they find 30 to 83; the price is usually more false alarms.</w:t>
+      </w:r>
+    </w:p>
+    <w:p>
+      <w:pPr>
+        <w:spacing w:after="160"/>
+        <w:ind w:left="360"/>
+      </w:pPr>
+      <w:r>
+        <w:rPr>
+          <w:i/>
+          <w:color w:val="4C5560"/>
+          <w:sz w:val="20"/>
+        </w:rPr>
+        <w:t>Nga çdo 100 erëra, ato gjejnë 30 deri 83; çmimi zakonisht është më shumë alarme të rreme.</w:t>
+      </w:r>
+    </w:p>
+    <w:p>
+      <w:pPr>
+        <w:spacing w:after="0"/>
+      </w:pPr>
+      <w:r>
+        <w:rPr>
+          <w:sz w:val="24"/>
+        </w:rPr>
         <w:t>We also computed 95 percent confidence intervals by resampling repositories.</w:t>
       </w:r>
     </w:p>
@@ -2585,7 +2806,7 @@
         <w:pStyle w:val="Heading1"/>
       </w:pPr>
       <w:r>
-        <w:t>Sllajdi 6 · For Feature Envy, even two experts agree no better than chance</w:t>
+        <w:t>Sllajdi 7 · For Feature Envy, even two experts agree no better than chance</w:t>
       </w:r>
     </w:p>
     <w:p>
@@ -2641,7 +2862,7 @@
         <w:pStyle w:val="ListBullet"/>
       </w:pPr>
       <w:r>
-        <w:t>Djathtas: i njëjti numër i madh me të kuqe, dhe fjalia kryesore e sllajdit me shkronja të trasha.</w:t>
+        <w:t>Djathtas: e njëjta shkallë e MCC-së si te sllajdi para tij, numri i madh me të kuqe («sa një monedhë e hedhur»), dhe fjalia kryesore me shkronja të trasha.</w:t>
       </w:r>
     </w:p>
     <w:p>
@@ -2991,7 +3212,7 @@
         <w:pStyle w:val="Heading1"/>
       </w:pPr>
       <w:r>
-        <w:t>Sllajdi 7 · The engine rewrites only what it can prove, and refuses the rest with a reason</w:t>
+        <w:t>Sllajdi 8 · The engine rewrites only what it can prove, and refuses the rest with a reason</w:t>
       </w:r>
     </w:p>
     <w:p>
@@ -3023,7 +3244,7 @@
         <w:pStyle w:val="ListBullet"/>
       </w:pPr>
       <w:r>
-        <w:t>Lart: 15,800 vende ku mund të zbatohej një ndreqje (një «site» është një vend konkret në kod).</w:t>
+        <w:t>Lart: 15,800 vende në kod ku mund të zbatohej një ndreqje («places in the code»).</w:t>
       </w:r>
     </w:p>
     <w:p>
@@ -3031,7 +3252,7 @@
         <w:pStyle w:val="ListBullet"/>
       </w:pPr>
       <w:r>
-        <w:t>Shiriti poshtë tij: pjesa blu janë 3,532 të rishkruarat (22.4%), pjesa gri janë 12,252 të refuzuarat (77.5%). Gjatësia e secilës pjese është sa pjesa e saj.</w:t>
+        <w:t>Shiriti poshtë tij: pjesa blu janë 3,532 të rishkruarat (22.4%), pjesa gri janë 12,252 të refuzuarat (77.5%), sepse nuk u vërtetuan të sigurta. Gjatësia e secilës pjese është sa pjesa e saj.</w:t>
       </w:r>
     </w:p>
     <w:p>
@@ -3039,7 +3260,7 @@
         <w:pStyle w:val="ListBullet"/>
       </w:pPr>
       <w:r>
-        <w:t>Tri kartat «Of the 3,532 rewrites»: 64.8% e hoqën erën; 1.6% shtuan një lloj të ri gabimi kompilimi dhe nuk shkruhen kurrë; 62.9% ishin të pranueshme në rishikimin me dorë të 60 rishkrimeve.</w:t>
+        <w:t>Tri kartat «What happened to the 3,532 rewrites»: 64.8% e hoqën erën; 1.6% shtuan një lloj të ri gabimi kompilimi dhe nuk shkruhen kurrë; 62.9% ishin të pranueshme në rishikimin me dorë të 60 rishkrimeve.</w:t>
       </w:r>
     </w:p>
     <w:p>
@@ -3487,7 +3708,7 @@
         <w:pStyle w:val="Heading1"/>
       </w:pPr>
       <w:r>
-        <w:t>Sllajdi 8 · Real code: the outer if becomes an early return</w:t>
+        <w:t>Sllajdi 9 · Real code: the outer if becomes an early return</w:t>
       </w:r>
     </w:p>
     <w:p>
@@ -3543,7 +3764,15 @@
         <w:pStyle w:val="ListBullet"/>
       </w:pPr>
       <w:r>
-        <w:t>Djathtas, tri hapa me numër: kushti bëhet dalje e hershme; pjesa tjetër ngjitet një nivel; e kaloi javac dhe u gjykua e pranueshme.</w:t>
+        <w:t>Djathtas lart, «−1 level» me të gjelbër: thellësia e blloqeve bie me një nivel, sepse gjithçka pas «rojës» ngjitet lart.</w:t>
+      </w:r>
+    </w:p>
+    <w:p>
+      <w:pPr>
+        <w:pStyle w:val="ListBullet"/>
+      </w:pPr>
+      <w:r>
+        <w:t>Poshtë saj, tri hapa me numër: kushti bëhet dalje e hershme; e kaloi javac; u gjykua i pranueshëm ashtu siç është.</w:t>
       </w:r>
     </w:p>
     <w:p>
@@ -3567,7 +3796,7 @@
         <w:pStyle w:val="ListBullet"/>
       </w:pPr>
       <w:r>
-        <w:t>Te «After…», trego brezin e gjelbër poshtë, pastaj hapat djathtas.</w:t>
+        <w:t>Te «After…», trego brezin e gjelbër poshtë. Te «moves one level up», trego «−1 level» djathtas.</w:t>
       </w:r>
     </w:p>
     <w:p>
@@ -3793,7 +4022,7 @@
         <w:pStyle w:val="Heading1"/>
       </w:pPr>
       <w:r>
-        <w:t>Sllajdi 9 · Limitations and takeaways</w:t>
+        <w:t>Sllajdi 10 · Three answers, and their limits</w:t>
       </w:r>
     </w:p>
     <w:p>
@@ -3841,7 +4070,7 @@
         <w:pStyle w:val="ListBullet"/>
       </w:pPr>
       <w:r>
-        <w:t>Djathtas, me blu të çelët, «Takeaways», mesazhet që merr salla me vete: kufijtë e mësuar i mundin pragjet fikse; automatizimi i sigurt është i ngushtë, por i matshëm; burim i hapur dhe i riprodhueshëm.</w:t>
+        <w:t>Djathtas, me blu të çelët, «Answers»: përgjigjja e secilës pyetje në një fjali, me etiketën Q1, Q2, Q3. Kështu salla largohet me tri përgjigje, jo me tri pyetje.</w:t>
       </w:r>
     </w:p>
     <w:p>
@@ -3865,7 +4094,7 @@
         <w:pStyle w:val="ListBullet"/>
       </w:pPr>
       <w:r>
-        <w:t>Trego kolonën e kuqe kur flet për kufizimet, pastaj kolonën blu te «To summarize».</w:t>
+        <w:t>Trego kolonën e kuqe kur flet për kufizimet, pastaj te «To summarize» trego përgjigjet Q1, Q2 dhe Q3 me radhë.</w:t>
       </w:r>
     </w:p>
     <w:p>
@@ -4215,7 +4444,7 @@
         <w:rPr>
           <w:b/>
         </w:rPr>
-        <w:t>Sllajdi 10 · Full detection results</w:t>
+        <w:t>Sllajdi 11 · Full detection results</w:t>
       </w:r>
     </w:p>
     <w:p>
@@ -4242,7 +4471,7 @@
         <w:rPr>
           <w:b/>
         </w:rPr>
-        <w:t>Sllajdi 11 · Confidence intervals</w:t>
+        <w:t>Sllajdi 12 · Confidence intervals</w:t>
       </w:r>
     </w:p>
     <w:p>
@@ -4269,7 +4498,7 @@
         <w:rPr>
           <w:b/>
         </w:rPr>
-        <w:t>Sllajdi 12 · Every algorithm</w:t>
+        <w:t>Sllajdi 13 · Every algorithm</w:t>
       </w:r>
     </w:p>
     <w:p>
@@ -4296,7 +4525,7 @@
         <w:rPr>
           <w:b/>
         </w:rPr>
-        <w:t>Sllajdi 13 · Comparison with PMD</w:t>
+        <w:t>Sllajdi 14 · Comparison with PMD</w:t>
       </w:r>
     </w:p>
     <w:p>
@@ -4323,7 +4552,7 @@
         <w:rPr>
           <w:b/>
         </w:rPr>
-        <w:t>Sllajdi 14 · Verification in detail</w:t>
+        <w:t>Sllajdi 15 · Verification in detail</w:t>
       </w:r>
     </w:p>
     <w:p>
@@ -4350,7 +4579,7 @@
         <w:rPr>
           <w:b/>
         </w:rPr>
-        <w:t>Sllajdi 15 · Extract Method in the interface</w:t>
+        <w:t>Sllajdi 16 · Extract Method in the interface</w:t>
       </w:r>
     </w:p>
     <w:p>
@@ -4377,7 +4606,7 @@
         <w:rPr>
           <w:b/>
         </w:rPr>
-        <w:t>Sllajdi 16 · Comparison with the literature</w:t>
+        <w:t>Sllajdi 17 · Comparison with the literature</w:t>
       </w:r>
     </w:p>
     <w:p>

</xml_diff>

<commit_message>
Lidh tekstin folës nga një sllajd te tjetri
</commit_message>
<xml_diff>
--- a/docs/konferenca/UBT2026_cka_te_flas.docx
+++ b/docs/konferenca/UBT2026_cka_te_flas.docx
@@ -246,7 +246,7 @@
           </w:tcPr>
           <w:p>
             <w:r>
-              <w:t>1:18</w:t>
+              <w:t>1:29</w:t>
             </w:r>
           </w:p>
         </w:tc>
@@ -256,7 +256,7 @@
           </w:tcPr>
           <w:p>
             <w:r>
-              <w:t>1:18</w:t>
+              <w:t>1:29</w:t>
             </w:r>
           </w:p>
         </w:tc>
@@ -298,7 +298,7 @@
           </w:tcPr>
           <w:p>
             <w:r>
-              <w:t>1:50</w:t>
+              <w:t>2:10</w:t>
             </w:r>
           </w:p>
         </w:tc>
@@ -308,7 +308,7 @@
           </w:tcPr>
           <w:p>
             <w:r>
-              <w:t>1:50</w:t>
+              <w:t>2:10</w:t>
             </w:r>
           </w:p>
         </w:tc>
@@ -350,7 +350,7 @@
           </w:tcPr>
           <w:p>
             <w:r>
-              <w:t>2:19</w:t>
+              <w:t>2:41</w:t>
             </w:r>
           </w:p>
         </w:tc>
@@ -360,7 +360,7 @@
           </w:tcPr>
           <w:p>
             <w:r>
-              <w:t>2:19</w:t>
+              <w:t>2:41</w:t>
             </w:r>
           </w:p>
         </w:tc>
@@ -402,7 +402,7 @@
           </w:tcPr>
           <w:p>
             <w:r>
-              <w:t>3:05</w:t>
+              <w:t>3:37</w:t>
             </w:r>
           </w:p>
         </w:tc>
@@ -412,7 +412,7 @@
           </w:tcPr>
           <w:p>
             <w:r>
-              <w:t>3:14</w:t>
+              <w:t>3:46</w:t>
             </w:r>
           </w:p>
         </w:tc>
@@ -454,7 +454,7 @@
           </w:tcPr>
           <w:p>
             <w:r>
-              <w:t>3:53</w:t>
+              <w:t>4:35</w:t>
             </w:r>
           </w:p>
         </w:tc>
@@ -464,7 +464,7 @@
           </w:tcPr>
           <w:p>
             <w:r>
-              <w:t>4:16</w:t>
+              <w:t>4:59</w:t>
             </w:r>
           </w:p>
         </w:tc>
@@ -506,7 +506,7 @@
           </w:tcPr>
           <w:p>
             <w:r>
-              <w:t>4:39</w:t>
+              <w:t>5:28</w:t>
             </w:r>
           </w:p>
         </w:tc>
@@ -516,7 +516,7 @@
           </w:tcPr>
           <w:p>
             <w:r>
-              <w:t>5:18</w:t>
+              <w:t>6:08</w:t>
             </w:r>
           </w:p>
         </w:tc>
@@ -558,7 +558,7 @@
           </w:tcPr>
           <w:p>
             <w:r>
-              <w:t>5:13</w:t>
+              <w:t>6:07</w:t>
             </w:r>
           </w:p>
         </w:tc>
@@ -568,7 +568,7 @@
           </w:tcPr>
           <w:p>
             <w:r>
-              <w:t>5:55</w:t>
+              <w:t>6:51</w:t>
             </w:r>
           </w:p>
         </w:tc>
@@ -610,7 +610,7 @@
           </w:tcPr>
           <w:p>
             <w:r>
-              <w:t>6:02</w:t>
+              <w:t>7:10</w:t>
             </w:r>
           </w:p>
         </w:tc>
@@ -620,7 +620,7 @@
           </w:tcPr>
           <w:p>
             <w:r>
-              <w:t>6:53</w:t>
+              <w:t>8:03</w:t>
             </w:r>
           </w:p>
         </w:tc>
@@ -662,7 +662,7 @@
           </w:tcPr>
           <w:p>
             <w:r>
-              <w:t>6:54</w:t>
+              <w:t>8:07</w:t>
             </w:r>
           </w:p>
         </w:tc>
@@ -672,7 +672,7 @@
           </w:tcPr>
           <w:p>
             <w:r>
-              <w:t>7:59</w:t>
+              <w:t>9:14</w:t>
             </w:r>
           </w:p>
         </w:tc>
@@ -714,7 +714,7 @@
           </w:tcPr>
           <w:p>
             <w:r>
-              <w:t>7:24</w:t>
+              <w:t>8:43</w:t>
             </w:r>
           </w:p>
         </w:tc>
@@ -724,7 +724,7 @@
           </w:tcPr>
           <w:p>
             <w:r>
-              <w:t>8:39</w:t>
+              <w:t>9:59</w:t>
             </w:r>
           </w:p>
         </w:tc>
@@ -766,7 +766,7 @@
           </w:tcPr>
           <w:p>
             <w:r>
-              <w:t>8:26</w:t>
+              <w:t>9:53</w:t>
             </w:r>
           </w:p>
         </w:tc>
@@ -776,7 +776,7 @@
           </w:tcPr>
           <w:p>
             <w:r>
-              <w:t>9:55</w:t>
+              <w:t>11:24</w:t>
             </w:r>
           </w:p>
         </w:tc>
@@ -818,7 +818,7 @@
           </w:tcPr>
           <w:p>
             <w:r>
-              <w:t>8:26</w:t>
+              <w:t>9:53</w:t>
             </w:r>
           </w:p>
         </w:tc>
@@ -828,7 +828,7 @@
           </w:tcPr>
           <w:p>
             <w:r>
-              <w:t>9:55</w:t>
+              <w:t>11:24</w:t>
             </w:r>
           </w:p>
         </w:tc>
@@ -1034,7 +1034,7 @@
         <w:rPr>
           <w:sz w:val="24"/>
         </w:rPr>
-        <w:t>In the next minutes I will show three things: how a tool can find design problems in Java code, how accurate it is, and whether it can also fix them.</w:t>
+        <w:t>Today I want to show you three things: how a tool can find design problems in Java code, how accurate it is, and whether it can also fix them.</w:t>
       </w:r>
     </w:p>
     <w:p>
@@ -1048,7 +1048,7 @@
           <w:color w:val="4C5560"/>
           <w:sz w:val="20"/>
         </w:rPr>
-        <w:t>Në minutat në vijim do të tregoj tri gjëra: si mund t'i gjejë një mjet problemet e ndërtimit në kodin Java, sa i saktë është, dhe a mund t'i ndreqë edhe vetë.</w:t>
+        <w:t>Sot dua t'ju tregoj tri gjëra: si mund t'i gjejë një mjet problemet e ndërtimit në kodin Java, sa i saktë është, dhe a mund t'i ndreqë edhe vetë.</w:t>
       </w:r>
     </w:p>
     <w:p>
@@ -1090,7 +1090,7 @@
     </w:p>
     <w:p>
       <w:r>
-        <w:t>Koha: rreth 52 sekonda në versionin e shkurtër, 52 në atë 9-minutësh.</w:t>
+        <w:t>Koha: rreth 63 sekonda në versionin e shkurtër, 63 në atë 9-minutësh.</w:t>
       </w:r>
     </w:p>
     <w:p>
@@ -1189,7 +1189,7 @@
         <w:rPr>
           <w:sz w:val="24"/>
         </w:rPr>
-        <w:t>Every developer knows the class that nobody wants to touch.</w:t>
+        <w:t>Let me start with a problem that every developer knows.</w:t>
       </w:r>
     </w:p>
     <w:p>
@@ -1203,7 +1203,7 @@
           <w:color w:val="4C5560"/>
           <w:sz w:val="20"/>
         </w:rPr>
-        <w:t>Çdo programues e njeh klasën që askush nuk do ta prekë.</w:t>
+        <w:t>Po filloj me një problem që e njeh çdo programues.</w:t>
       </w:r>
     </w:p>
     <w:p>
@@ -1214,7 +1214,7 @@
         <w:rPr>
           <w:sz w:val="24"/>
         </w:rPr>
-        <w:t>The program works, but every small change takes too long.</w:t>
+        <w:t>There is always one class that nobody wants to touch.</w:t>
       </w:r>
     </w:p>
     <w:p>
@@ -1228,7 +1228,7 @@
           <w:color w:val="4C5560"/>
           <w:sz w:val="20"/>
         </w:rPr>
-        <w:t>Programi punon, por çdo ndryshim i vogël zgjat shumë.</w:t>
+        <w:t>Gjithmonë ka një klasë që askush nuk do ta prekë.</w:t>
       </w:r>
     </w:p>
     <w:p>
@@ -1239,7 +1239,7 @@
         <w:rPr>
           <w:sz w:val="24"/>
         </w:rPr>
-        <w:t>We call these design problems code smells.</w:t>
+        <w:t>The program works, but every small change takes too long.</w:t>
       </w:r>
     </w:p>
     <w:p>
@@ -1253,7 +1253,7 @@
           <w:color w:val="4C5560"/>
           <w:sz w:val="20"/>
         </w:rPr>
-        <w:t>Këto probleme të ndërtimit i quajmë erëra të kodit.</w:t>
+        <w:t>Programi punon, por çdo ndryshim i vogël zgjat shumë.</w:t>
       </w:r>
     </w:p>
     <w:p>
@@ -1264,7 +1264,7 @@
         <w:rPr>
           <w:sz w:val="24"/>
         </w:rPr>
-        <w:t>They are not bugs. They make the code expensive to change.</w:t>
+        <w:t>We call these design problems code smells.</w:t>
       </w:r>
     </w:p>
     <w:p>
@@ -1278,7 +1278,7 @@
           <w:color w:val="4C5560"/>
           <w:sz w:val="20"/>
         </w:rPr>
-        <w:t>Nuk janë gabime. E bëjnë kodin të shtrenjtë për t'u ndryshuar.</w:t>
+        <w:t>Këto probleme të ndërtimit i quajmë erëra të kodit.</w:t>
       </w:r>
     </w:p>
     <w:p>
@@ -1289,7 +1289,7 @@
         <w:rPr>
           <w:sz w:val="24"/>
         </w:rPr>
-        <w:t>Most tools use fixed numbers: if a method has more than 30 lines, it is a Long Method.</w:t>
+        <w:t>They are not bugs. They just make the code expensive to change.</w:t>
       </w:r>
     </w:p>
     <w:p>
@@ -1303,7 +1303,7 @@
           <w:color w:val="4C5560"/>
           <w:sz w:val="20"/>
         </w:rPr>
-        <w:t>Shumica e mjeteve përdorin numra fiksë: nëse një metodë ka më shumë se 30 rreshta, ajo është Long Method.</w:t>
+        <w:t>Nuk janë gabime. Thjesht e bëjnë kodin të shtrenjtë për t'u ndryshuar.</w:t>
       </w:r>
     </w:p>
     <w:p>
@@ -1314,7 +1314,7 @@
         <w:rPr>
           <w:sz w:val="24"/>
         </w:rPr>
-        <w:t>But these numbers come from other projects, and the tools do not fix anything.</w:t>
+        <w:t>Most tools find them with fixed numbers. For example: if a method has more than 30 lines, it is a Long Method.</w:t>
       </w:r>
     </w:p>
     <w:p>
@@ -1328,7 +1328,7 @@
           <w:color w:val="4C5560"/>
           <w:sz w:val="20"/>
         </w:rPr>
-        <w:t>Por këta numra vijnë nga projekte të tjera, dhe mjetet nuk ndreqin asgjë.</w:t>
+        <w:t>Shumica e mjeteve i gjejnë me numra fiksë. Për shembull: nëse një metodë ka më shumë se 30 rreshta, ajo është Long Method.</w:t>
       </w:r>
     </w:p>
     <w:p>
@@ -1339,7 +1339,7 @@
         <w:rPr>
           <w:sz w:val="24"/>
         </w:rPr>
-        <w:t>So I asked three questions.</w:t>
+        <w:t>But these numbers come from other projects, and the tools only point at the problem. They do not fix it.</w:t>
       </w:r>
     </w:p>
     <w:p>
@@ -1353,7 +1353,7 @@
           <w:color w:val="4C5560"/>
           <w:sz w:val="20"/>
         </w:rPr>
-        <w:t>Prandaj bëra tri pyetje.</w:t>
+        <w:t>Por këta numra vijnë nga projekte të tjera, dhe mjetet vetëm e tregojnë problemin. Nuk e ndreqin.</w:t>
       </w:r>
     </w:p>
     <w:p>
@@ -1364,7 +1364,7 @@
         <w:rPr>
           <w:sz w:val="24"/>
         </w:rPr>
-        <w:t>One: how accurate are the published rules?</w:t>
+        <w:t>So I asked three questions.</w:t>
       </w:r>
     </w:p>
     <w:p>
@@ -1378,7 +1378,7 @@
           <w:color w:val="4C5560"/>
           <w:sz w:val="20"/>
         </w:rPr>
-        <w:t>Një: sa të sakta janë rregullat e botuara?</w:t>
+        <w:t>Prandaj bëra tri pyetje.</w:t>
       </w:r>
     </w:p>
     <w:p>
@@ -1389,7 +1389,7 @@
         <w:rPr>
           <w:sz w:val="24"/>
         </w:rPr>
-        <w:t>Two: can machine learning do better?</w:t>
+        <w:t>One: how accurate are the published rules?</w:t>
       </w:r>
     </w:p>
     <w:p>
@@ -1403,7 +1403,7 @@
           <w:color w:val="4C5560"/>
           <w:sz w:val="20"/>
         </w:rPr>
-        <w:t>Dy: a mund të bëjë më mirë mësimi makinerik?</w:t>
+        <w:t>Një: sa të sakta janë rregullat e botuara?</w:t>
       </w:r>
     </w:p>
     <w:p>
@@ -1414,7 +1414,7 @@
         <w:rPr>
           <w:sz w:val="24"/>
         </w:rPr>
-        <w:t>Three: can a tool fix these smells automatically, without breaking the code?</w:t>
+        <w:t>Two: can machine learning do better?</w:t>
       </w:r>
     </w:p>
     <w:p>
@@ -1428,28 +1428,7 @@
           <w:color w:val="4C5560"/>
           <w:sz w:val="20"/>
         </w:rPr>
-        <w:t>Tre: a mund t'i ndreqë një mjet këto erëra automatikisht, pa e prishur kodin?</w:t>
-      </w:r>
-    </w:p>
-    <w:p>
-      <w:pPr>
-        <w:pStyle w:val="Heading2"/>
-      </w:pPr>
-      <w:r>
-        <w:t>Nëse të ngec mendja</w:t>
-      </w:r>
-    </w:p>
-    <w:p>
-      <w:r>
-        <w:t>punon, por kushton · pragje fikse · nuk ndreqin · tri pyetje</w:t>
-      </w:r>
-    </w:p>
-    <w:p>
-      <w:pPr>
-        <w:pStyle w:val="Heading2"/>
-      </w:pPr>
-      <w:r>
-        <w:t>Nëse të pyesin për këtë sllajd</w:t>
+        <w:t>Dy: a mund të bëjë më mirë mësimi makinerik?</w:t>
       </w:r>
     </w:p>
     <w:p>
@@ -1458,32 +1437,14 @@
       </w:pPr>
       <w:r>
         <w:rPr>
-          <w:b/>
-        </w:rPr>
-        <w:t>What is a code smell?</w:t>
-      </w:r>
-      <w:r>
-        <w:rPr>
-          <w:i/>
-          <w:color w:val="4C5560"/>
-        </w:rPr>
-        <w:t xml:space="preserve">   (Çka është një erë e kodit?)</w:t>
-      </w:r>
-    </w:p>
-    <w:p>
-      <w:pPr>
-        <w:spacing w:after="0"/>
-      </w:pPr>
-      <w:r>
-        <w:rPr>
           <w:sz w:val="24"/>
         </w:rPr>
-        <w:t>A sign that code is badly organized: it works, but it is hard to change. Like a smell in the fridge, it does not prove something is rotten, but it tells you to look.</w:t>
-      </w:r>
-    </w:p>
-    <w:p>
-      <w:pPr>
-        <w:spacing w:after="200"/>
+        <w:t>Three: can a tool fix these smells automatically, without breaking the code?</w:t>
+      </w:r>
+    </w:p>
+    <w:p>
+      <w:pPr>
+        <w:spacing w:after="160"/>
         <w:ind w:left="360"/>
       </w:pPr>
       <w:r>
@@ -1492,7 +1453,28 @@
           <w:color w:val="4C5560"/>
           <w:sz w:val="20"/>
         </w:rPr>
-        <w:t>Shenjë që kodi është i organizuar keq: punon, por ndryshohet me vështirësi. Si era në frigorifer: nuk vërteton që diçka është prishur, por të thotë të shikosh.</w:t>
+        <w:t>Tre: a mund t'i ndreqë një mjet këto erëra automatikisht, pa e prishur kodin?</w:t>
+      </w:r>
+    </w:p>
+    <w:p>
+      <w:pPr>
+        <w:pStyle w:val="Heading2"/>
+      </w:pPr>
+      <w:r>
+        <w:t>Nëse të ngec mendja</w:t>
+      </w:r>
+    </w:p>
+    <w:p>
+      <w:r>
+        <w:t>punon, por kushton · pragje fikse · nuk ndreqin · tri pyetje</w:t>
+      </w:r>
+    </w:p>
+    <w:p>
+      <w:pPr>
+        <w:pStyle w:val="Heading2"/>
+      </w:pPr>
+      <w:r>
+        <w:t>Nëse të pyesin për këtë sllajd</w:t>
       </w:r>
     </w:p>
     <w:p>
@@ -1503,14 +1485,14 @@
         <w:rPr>
           <w:b/>
         </w:rPr>
-        <w:t>If the program works, why does it matter?</w:t>
+        <w:t>What is a code smell?</w:t>
       </w:r>
       <w:r>
         <w:rPr>
           <w:i/>
           <w:color w:val="4C5560"/>
         </w:rPr>
-        <w:t xml:space="preserve">   (Nëse programi punon, pse ka rëndësi?)</w:t>
+        <w:t xml:space="preserve">   (Çka është një erë e kodit?)</w:t>
       </w:r>
     </w:p>
     <w:p>
@@ -1521,7 +1503,7 @@
         <w:rPr>
           <w:sz w:val="24"/>
         </w:rPr>
-        <w:t>Because most of the cost of software comes after it is written: fixing it, changing it, adding features. Smelly code makes every change slower and riskier.</w:t>
+        <w:t>A sign that code is badly organized: it works, but it is hard to change. Like a smell in the fridge, it does not prove something is rotten, but it tells you to look.</w:t>
       </w:r>
     </w:p>
     <w:p>
@@ -1535,7 +1517,7 @@
           <w:color w:val="4C5560"/>
           <w:sz w:val="20"/>
         </w:rPr>
-        <w:t>Sepse shumica e kostos së një programi vjen pasi shkruhet: ndreqjet, ndryshimet, veçoritë e reja. Kodi me erë e bën çdo ndryshim më të ngadaltë dhe më të rrezikshëm.</w:t>
+        <w:t>Shenjë që kodi është i organizuar keq: punon, por ndryshohet me vështirësi. Si era në frigorifer: nuk vërteton që diçka është prishur, por të thotë të shikosh.</w:t>
       </w:r>
     </w:p>
     <w:p>
@@ -1546,14 +1528,14 @@
         <w:rPr>
           <w:b/>
         </w:rPr>
-        <w:t>Where do the thresholds come from?</w:t>
+        <w:t>If the program works, why does it matter?</w:t>
       </w:r>
       <w:r>
         <w:rPr>
           <w:i/>
           <w:color w:val="4C5560"/>
         </w:rPr>
-        <w:t xml:space="preserve">   (Nga vijnë pragjet?)</w:t>
+        <w:t xml:space="preserve">   (Nëse programi punon, pse ka rëndësi?)</w:t>
       </w:r>
     </w:p>
     <w:p>
@@ -1564,7 +1546,7 @@
         <w:rPr>
           <w:sz w:val="24"/>
         </w:rPr>
-        <w:t>Mostly from Lanza and Marinescu. Four values have no published source, for example 30 lines for Long Method. I say so in the thesis, and I tested how sensitive the results are to that one.</w:t>
+        <w:t>Because most of the cost of software comes after it is written: fixing it, changing it, adding features. Smelly code makes every change slower and riskier.</w:t>
       </w:r>
     </w:p>
     <w:p>
@@ -1578,108 +1560,25 @@
           <w:color w:val="4C5560"/>
           <w:sz w:val="20"/>
         </w:rPr>
-        <w:t>Kryesisht nga Lanza dhe Marinescu. Katër vlera nuk kanë burim të botuar, për shembull 30 rreshta për Long Method. Këtë e them hapur në punim, dhe provova sa ndikon ajo vlerë te rezultatet.</w:t>
-      </w:r>
-    </w:p>
-    <w:p>
-      <w:r>
-        <w:br w:type="page"/>
-      </w:r>
-    </w:p>
-    <w:p>
-      <w:pPr>
-        <w:pStyle w:val="Heading1"/>
-      </w:pPr>
-      <w:r>
-        <w:t>Sllajdi 3 · What this work adds to earlier studies</w:t>
-      </w:r>
-    </w:p>
-    <w:p>
+        <w:t>Sepse shumica e kostos së një programi vjen pasi shkruhet: ndreqjet, ndryshimet, veçoritë e reja. Kodi me erë e bën çdo ndryshim më të ngadaltë dhe më të rrezikshëm.</w:t>
+      </w:r>
+    </w:p>
+    <w:p>
+      <w:pPr>
+        <w:spacing w:after="0"/>
+      </w:pPr>
       <w:r>
         <w:rPr>
           <w:b/>
         </w:rPr>
-        <w:t xml:space="preserve">Mesazhi: </w:t>
-      </w:r>
-      <w:r>
-        <w:t>Çka e dallon punimin: tri mangësi të studimeve të mëparshme dhe si e trajton secilën, plus një mjet i hapur.</w:t>
-      </w:r>
-    </w:p>
-    <w:p>
-      <w:r>
-        <w:t>Koha: rreth 32 sekonda në versionin e shkurtër, 32 në atë 9-minutësh.</w:t>
-      </w:r>
-    </w:p>
-    <w:p>
-      <w:pPr>
-        <w:pStyle w:val="Heading2"/>
-      </w:pPr>
-      <w:r>
-        <w:t>Çka shihet në sllajd</w:t>
-      </w:r>
-    </w:p>
-    <w:p>
-      <w:pPr>
-        <w:pStyle w:val="ListBullet"/>
-      </w:pPr>
-      <w:r>
-        <w:t>Dy kolona: majtas, me gri, «Earlier studies»; djathtas, me blu të çelët dhe shkronja të trasha, «This work». Shigjeta mes tyre e lidh secilën mangësi me përgjigjen e punimit.</w:t>
-      </w:r>
-    </w:p>
-    <w:p>
-      <w:pPr>
-        <w:pStyle w:val="ListBullet"/>
-      </w:pPr>
-      <w:r>
-        <w:t>Rreshti 1: rregullat e botuara merren si të sakta, me pragje të vendosura mbi sisteme të tjera [2] → këtu maten kundrejt 26 programuesve profesionistë të MLCQ-së [3].</w:t>
-      </w:r>
-    </w:p>
-    <w:p>
-      <w:pPr>
-        <w:pStyle w:val="ListBullet"/>
-      </w:pPr>
-      <w:r>
-        <w:t>Rreshti 2: rregullat dhe mësimi makinerik rrallë krahasohen mbi të njëjtat të dhëna, dhe notat varen nga mënyra si ndërtohen të dhënat [4], [5] → këtu të njëjtat 9,046 mostra, e njëjta notë (MCC), ndarje sipas projektit, me intervale 95%.</w:t>
-      </w:r>
-    </w:p>
-    <w:p>
-      <w:pPr>
-        <w:pStyle w:val="ListBullet"/>
-      </w:pPr>
-      <w:r>
-        <w:t>Rreshti 3: gjetja dhe ndreqja studiohen veç e veç; ndreqja propozohet dhe vendimi i lihet programuesit [6] → këtu një zinxhir: gjej → rishkruaj → kompilo → mat sërish, me parakushtet të vërtetuara më parë [7].</w:t>
-      </w:r>
-    </w:p>
-    <w:p>
-      <w:pPr>
-        <w:pStyle w:val="ListBullet"/>
-      </w:pPr>
-      <w:r>
-        <w:t>Poshtë djathtas, me blu: mjeti është i hapur, me ndërfaqe në shqip të thjeshtë, dhe çdo numër rikrijohet me një skript.</w:t>
-      </w:r>
-    </w:p>
-    <w:p>
-      <w:pPr>
-        <w:pStyle w:val="Heading2"/>
-      </w:pPr>
-      <w:r>
-        <w:t>Ku të tregosh</w:t>
-      </w:r>
-    </w:p>
-    <w:p>
-      <w:pPr>
-        <w:pStyle w:val="ListBullet"/>
-      </w:pPr>
-      <w:r>
-        <w:t>Te «First…», «Second…» dhe «Third…», trego rreshtin përkatës: fillo te kutia gri majtas, pastaj kalo me dorë te kutia blu djathtas.</w:t>
-      </w:r>
-    </w:p>
-    <w:p>
-      <w:pPr>
-        <w:pStyle w:val="Heading2"/>
-      </w:pPr>
-      <w:r>
-        <w:t>Çka thua</w:t>
+        <w:t>Where do the thresholds come from?</w:t>
+      </w:r>
+      <w:r>
+        <w:rPr>
+          <w:i/>
+          <w:color w:val="4C5560"/>
+        </w:rPr>
+        <w:t xml:space="preserve">   (Nga vijnë pragjet?)</w:t>
       </w:r>
     </w:p>
     <w:p>
@@ -1690,12 +1589,12 @@
         <w:rPr>
           <w:sz w:val="24"/>
         </w:rPr>
-        <w:t>What is new, compared with earlier studies? Three things.</w:t>
-      </w:r>
-    </w:p>
-    <w:p>
-      <w:pPr>
-        <w:spacing w:after="160"/>
+        <w:t>Mostly from Lanza and Marinescu. Four values have no published source, for example 30 lines for Long Method. I say so in the thesis, and I tested how sensitive the results are to that one.</w:t>
+      </w:r>
+    </w:p>
+    <w:p>
+      <w:pPr>
+        <w:spacing w:after="200"/>
         <w:ind w:left="360"/>
       </w:pPr>
       <w:r>
@@ -1704,7 +1603,108 @@
           <w:color w:val="4C5560"/>
           <w:sz w:val="20"/>
         </w:rPr>
-        <w:t>Çka është e re, krahasuar me studimet e mëparshme? Tri gjëra.</w:t>
+        <w:t>Kryesisht nga Lanza dhe Marinescu. Katër vlera nuk kanë burim të botuar, për shembull 30 rreshta për Long Method. Këtë e them hapur në punim, dhe provova sa ndikon ajo vlerë te rezultatet.</w:t>
+      </w:r>
+    </w:p>
+    <w:p>
+      <w:r>
+        <w:br w:type="page"/>
+      </w:r>
+    </w:p>
+    <w:p>
+      <w:pPr>
+        <w:pStyle w:val="Heading1"/>
+      </w:pPr>
+      <w:r>
+        <w:t>Sllajdi 3 · What this work adds to earlier studies</w:t>
+      </w:r>
+    </w:p>
+    <w:p>
+      <w:r>
+        <w:rPr>
+          <w:b/>
+        </w:rPr>
+        <w:t xml:space="preserve">Mesazhi: </w:t>
+      </w:r>
+      <w:r>
+        <w:t>Çka e dallon punimin: tri mangësi të studimeve të mëparshme dhe si e trajton secilën, plus një mjet i hapur.</w:t>
+      </w:r>
+    </w:p>
+    <w:p>
+      <w:r>
+        <w:t>Koha: rreth 41 sekonda në versionin e shkurtër, 41 në atë 9-minutësh.</w:t>
+      </w:r>
+    </w:p>
+    <w:p>
+      <w:pPr>
+        <w:pStyle w:val="Heading2"/>
+      </w:pPr>
+      <w:r>
+        <w:t>Çka shihet në sllajd</w:t>
+      </w:r>
+    </w:p>
+    <w:p>
+      <w:pPr>
+        <w:pStyle w:val="ListBullet"/>
+      </w:pPr>
+      <w:r>
+        <w:t>Dy kolona: majtas, me gri, «Earlier studies»; djathtas, me blu të çelët dhe shkronja të trasha, «This work». Shigjeta mes tyre e lidh secilën mangësi me përgjigjen e punimit.</w:t>
+      </w:r>
+    </w:p>
+    <w:p>
+      <w:pPr>
+        <w:pStyle w:val="ListBullet"/>
+      </w:pPr>
+      <w:r>
+        <w:t>Rreshti 1: rregullat e botuara merren si të sakta, me pragje të vendosura mbi sisteme të tjera [2] → këtu maten kundrejt 26 programuesve profesionistë të MLCQ-së [3].</w:t>
+      </w:r>
+    </w:p>
+    <w:p>
+      <w:pPr>
+        <w:pStyle w:val="ListBullet"/>
+      </w:pPr>
+      <w:r>
+        <w:t>Rreshti 2: rregullat dhe mësimi makinerik rrallë krahasohen mbi të njëjtat të dhëna, dhe notat varen nga mënyra si ndërtohen të dhënat [4], [5] → këtu të njëjtat 9,046 mostra, e njëjta notë (MCC), ndarje sipas projektit, me intervale 95%.</w:t>
+      </w:r>
+    </w:p>
+    <w:p>
+      <w:pPr>
+        <w:pStyle w:val="ListBullet"/>
+      </w:pPr>
+      <w:r>
+        <w:t>Rreshti 3: gjetja dhe ndreqja studiohen veç e veç; ndreqja propozohet dhe vendimi i lihet programuesit [6] → këtu një zinxhir: gjej → rishkruaj → kompilo → mat sërish, me parakushtet të vërtetuara më parë [7].</w:t>
+      </w:r>
+    </w:p>
+    <w:p>
+      <w:pPr>
+        <w:pStyle w:val="ListBullet"/>
+      </w:pPr>
+      <w:r>
+        <w:t>Poshtë djathtas, me blu: mjeti është i hapur, me ndërfaqe në shqip të thjeshtë, dhe çdo numër rikrijohet me një skript.</w:t>
+      </w:r>
+    </w:p>
+    <w:p>
+      <w:pPr>
+        <w:pStyle w:val="Heading2"/>
+      </w:pPr>
+      <w:r>
+        <w:t>Ku të tregosh</w:t>
+      </w:r>
+    </w:p>
+    <w:p>
+      <w:pPr>
+        <w:pStyle w:val="ListBullet"/>
+      </w:pPr>
+      <w:r>
+        <w:t>Te «First…», «Second…» dhe «Third…», trego rreshtin përkatës: fillo te kutia gri majtas, pastaj kalo me dorë te kutia blu djathtas.</w:t>
+      </w:r>
+    </w:p>
+    <w:p>
+      <w:pPr>
+        <w:pStyle w:val="Heading2"/>
+      </w:pPr>
+      <w:r>
+        <w:t>Çka thua</w:t>
       </w:r>
     </w:p>
     <w:p>
@@ -1715,7 +1715,7 @@
         <w:rPr>
           <w:sz w:val="24"/>
         </w:rPr>
-        <w:t>First, I measure the published rules against professional developers, instead of taking them as correct.</w:t>
+        <w:t>Other researchers have worked on these questions before. So what is new in my work? Three things.</w:t>
       </w:r>
     </w:p>
     <w:p>
@@ -1729,7 +1729,7 @@
           <w:color w:val="4C5560"/>
           <w:sz w:val="20"/>
         </w:rPr>
-        <w:t>E para, i mat rregullat e botuara kundrejt programuesve profesionistë, në vend që t'i marr si të sakta.</w:t>
+        <w:t>Studiues të tjerë janë marrë me këto pyetje edhe më parë. Atëherë, çka është e re në punën time? Tri gjëra.</w:t>
       </w:r>
     </w:p>
     <w:p>
@@ -1740,7 +1740,7 @@
         <w:rPr>
           <w:sz w:val="24"/>
         </w:rPr>
-        <w:t>Second, rules and machine learning are compared on the same samples, with the same score and a split by project.</w:t>
+        <w:t>First, earlier studies take the published rules as correct. I measure them against professional developers.</w:t>
       </w:r>
     </w:p>
     <w:p>
@@ -1754,7 +1754,7 @@
           <w:color w:val="4C5560"/>
           <w:sz w:val="20"/>
         </w:rPr>
-        <w:t>E dyta, rregullat dhe mësimi makinerik krahasohen mbi të njëjtat mostra, me të njëjtën notë dhe me ndarje sipas projektit.</w:t>
+        <w:t>E para, studimet e mëparshme i marrin rregullat e botuara si të sakta. Unë i mat kundrejt programuesve profesionistë.</w:t>
       </w:r>
     </w:p>
     <w:p>
@@ -1765,7 +1765,7 @@
         <w:rPr>
           <w:sz w:val="24"/>
         </w:rPr>
-        <w:t>Third, one tool finds a smell, fixes it, checks it with the compiler, and measures it again.</w:t>
+        <w:t>Second, I compare rules and machine learning in a fair way: on the same samples, with the same score, and with a split by project.</w:t>
       </w:r>
     </w:p>
     <w:p>
@@ -1779,121 +1779,7 @@
           <w:color w:val="4C5560"/>
           <w:sz w:val="20"/>
         </w:rPr>
-        <w:t>E treta, një mjet e gjen erën, e ndreq, e kontrollon me kompajlerin, dhe e mat sërish.</w:t>
-      </w:r>
-    </w:p>
-    <w:p>
-      <w:pPr>
-        <w:pStyle w:val="Heading2"/>
-      </w:pPr>
-      <w:r>
-        <w:t>Nëse të ngec mendja</w:t>
-      </w:r>
-    </w:p>
-    <w:p>
-      <w:r>
-        <w:t>tri mangësi · rregullat maten · e njëjta provë · një zinxhir · mjet i hapur</w:t>
-      </w:r>
-    </w:p>
-    <w:p>
-      <w:r>
-        <w:br w:type="page"/>
-      </w:r>
-    </w:p>
-    <w:p>
-      <w:pPr>
-        <w:pStyle w:val="Heading1"/>
-      </w:pPr>
-      <w:r>
-        <w:t>Sllajdi 4 · Four code smells, each a different design problem</w:t>
-      </w:r>
-    </w:p>
-    <w:p>
-      <w:r>
-        <w:rPr>
-          <w:b/>
-        </w:rPr>
-        <w:t xml:space="preserve">Mesazhi: </w:t>
-      </w:r>
-      <w:r>
-        <w:t>Katër erërat që mat studimi, të vizatuara: salla e sheh çka është secila para se të dëgjojë një numër.</w:t>
-      </w:r>
-    </w:p>
-    <w:p>
-      <w:r>
-        <w:t>Koha: rreth 29 sekonda në versionin e shkurtër, 29 në atë 9-minutësh.</w:t>
-      </w:r>
-    </w:p>
-    <w:p>
-      <w:pPr>
-        <w:pStyle w:val="Heading2"/>
-      </w:pPr>
-      <w:r>
-        <w:t>Çka shihet në sllajd</w:t>
-      </w:r>
-    </w:p>
-    <w:p>
-      <w:pPr>
-        <w:pStyle w:val="ListBullet"/>
-      </w:pPr>
-      <w:r>
-        <w:t>Katër karta, një për çdo erë. Në secilën: një vizatim, emri dhe një fjali që e përkufizon.</w:t>
-      </w:r>
-    </w:p>
-    <w:p>
-      <w:pPr>
-        <w:pStyle w:val="ListBullet"/>
-      </w:pPr>
-      <w:r>
-        <w:t>Si lexohen vizatimet: kutia është një klasë, vija blu një metodë, pika gri një fushë (një e dhënë). Kjo shkruhet edhe poshtë kartave.</w:t>
-      </w:r>
-    </w:p>
-    <w:p>
-      <w:pPr>
-        <w:pStyle w:val="ListBullet"/>
-      </w:pPr>
-      <w:r>
-        <w:t>Blob: një kuti e madhe plot metoda, që merr të dhëna edhe nga dy klasa të vogla. Data Class: një kuti vetëm me fusha, dhe një klasë tjetër me metodën që punon me to. Long Method: një kolonë e gjatë rreshtash kodi. Feature Envy: një metodë në klasën e vet («own class») që zgjatet me tri vija te fushat e një klase tjetër.</w:t>
-      </w:r>
-    </w:p>
-    <w:p>
-      <w:pPr>
-        <w:pStyle w:val="ListBullet"/>
-      </w:pPr>
-      <w:r>
-        <w:t>Nëntitulli: përkufizimet sipas Fowler-it [1], dhe të katërat janë të etiketuara nga programues profesionistë në MLCQ [3].</w:t>
-      </w:r>
-    </w:p>
-    <w:p>
-      <w:pPr>
-        <w:pStyle w:val="Heading2"/>
-      </w:pPr>
-      <w:r>
-        <w:t>Ku të tregosh</w:t>
-      </w:r>
-    </w:p>
-    <w:p>
-      <w:pPr>
-        <w:pStyle w:val="ListBullet"/>
-      </w:pPr>
-      <w:r>
-        <w:t>Trego kartat me radhë, nga e majta në të djathtë, kur thua emrin e secilës.</w:t>
-      </w:r>
-    </w:p>
-    <w:p>
-      <w:pPr>
-        <w:pStyle w:val="ListBullet"/>
-      </w:pPr>
-      <w:r>
-        <w:t>Te Feature Envy, ndiq me gisht vijat blu nga «own class» te «other class».</w:t>
-      </w:r>
-    </w:p>
-    <w:p>
-      <w:pPr>
-        <w:pStyle w:val="Heading2"/>
-      </w:pPr>
-      <w:r>
-        <w:t>Çka thua</w:t>
+        <w:t>E dyta, i krahasoj rregullat dhe mësimin makinerik në mënyrë të drejtë: mbi të njëjtat mostra, me të njëjtën notë, dhe me ndarje sipas projektit.</w:t>
       </w:r>
     </w:p>
     <w:p>
@@ -1904,7 +1790,7 @@
         <w:rPr>
           <w:sz w:val="24"/>
         </w:rPr>
-        <w:t>In this study I look at four smells.</w:t>
+        <w:t>Third, earlier tools only suggest a fix. Mine finds a smell, fixes it, checks it with the compiler, and measures it again.</w:t>
       </w:r>
     </w:p>
     <w:p>
@@ -1918,7 +1804,121 @@
           <w:color w:val="4C5560"/>
           <w:sz w:val="20"/>
         </w:rPr>
-        <w:t>Në këtë studim shqyrtoj katër erëra.</w:t>
+        <w:t>E treta, mjetet e mëparshme vetëm sugjerojnë një ndreqje. Imi e gjen erën, e ndreq, e kontrollon me kompajlerin, dhe e mat sërish.</w:t>
+      </w:r>
+    </w:p>
+    <w:p>
+      <w:pPr>
+        <w:pStyle w:val="Heading2"/>
+      </w:pPr>
+      <w:r>
+        <w:t>Nëse të ngec mendja</w:t>
+      </w:r>
+    </w:p>
+    <w:p>
+      <w:r>
+        <w:t>tri mangësi · rregullat maten · e njëjta provë · një zinxhir · mjet i hapur</w:t>
+      </w:r>
+    </w:p>
+    <w:p>
+      <w:r>
+        <w:br w:type="page"/>
+      </w:r>
+    </w:p>
+    <w:p>
+      <w:pPr>
+        <w:pStyle w:val="Heading1"/>
+      </w:pPr>
+      <w:r>
+        <w:t>Sllajdi 4 · Four code smells, each a different design problem</w:t>
+      </w:r>
+    </w:p>
+    <w:p>
+      <w:r>
+        <w:rPr>
+          <w:b/>
+        </w:rPr>
+        <w:t xml:space="preserve">Mesazhi: </w:t>
+      </w:r>
+      <w:r>
+        <w:t>Katër erërat që mat studimi, të vizatuara: salla e sheh çka është secila para se të dëgjojë një numër.</w:t>
+      </w:r>
+    </w:p>
+    <w:p>
+      <w:r>
+        <w:t>Koha: rreth 31 sekonda në versionin e shkurtër, 31 në atë 9-minutësh.</w:t>
+      </w:r>
+    </w:p>
+    <w:p>
+      <w:pPr>
+        <w:pStyle w:val="Heading2"/>
+      </w:pPr>
+      <w:r>
+        <w:t>Çka shihet në sllajd</w:t>
+      </w:r>
+    </w:p>
+    <w:p>
+      <w:pPr>
+        <w:pStyle w:val="ListBullet"/>
+      </w:pPr>
+      <w:r>
+        <w:t>Katër karta, një për çdo erë. Në secilën: një vizatim, emri dhe një fjali që e përkufizon.</w:t>
+      </w:r>
+    </w:p>
+    <w:p>
+      <w:pPr>
+        <w:pStyle w:val="ListBullet"/>
+      </w:pPr>
+      <w:r>
+        <w:t>Si lexohen vizatimet: kutia është një klasë, vija blu një metodë, pika gri një fushë (një e dhënë). Kjo shkruhet edhe poshtë kartave.</w:t>
+      </w:r>
+    </w:p>
+    <w:p>
+      <w:pPr>
+        <w:pStyle w:val="ListBullet"/>
+      </w:pPr>
+      <w:r>
+        <w:t>Blob: një kuti e madhe plot metoda, që merr të dhëna edhe nga dy klasa të vogla. Data Class: një kuti vetëm me fusha, dhe një klasë tjetër me metodën që punon me to. Long Method: një kolonë e gjatë rreshtash kodi. Feature Envy: një metodë në klasën e vet («own class») që zgjatet me tri vija te fushat e një klase tjetër.</w:t>
+      </w:r>
+    </w:p>
+    <w:p>
+      <w:pPr>
+        <w:pStyle w:val="ListBullet"/>
+      </w:pPr>
+      <w:r>
+        <w:t>Nëntitulli: përkufizimet sipas Fowler-it [1], dhe të katërat janë të etiketuara nga programues profesionistë në MLCQ [3].</w:t>
+      </w:r>
+    </w:p>
+    <w:p>
+      <w:pPr>
+        <w:pStyle w:val="Heading2"/>
+      </w:pPr>
+      <w:r>
+        <w:t>Ku të tregosh</w:t>
+      </w:r>
+    </w:p>
+    <w:p>
+      <w:pPr>
+        <w:pStyle w:val="ListBullet"/>
+      </w:pPr>
+      <w:r>
+        <w:t>Trego kartat me radhë, nga e majta në të djathtë, kur thua emrin e secilës.</w:t>
+      </w:r>
+    </w:p>
+    <w:p>
+      <w:pPr>
+        <w:pStyle w:val="ListBullet"/>
+      </w:pPr>
+      <w:r>
+        <w:t>Te Feature Envy, ndiq me gisht vijat blu nga «own class» te «other class».</w:t>
+      </w:r>
+    </w:p>
+    <w:p>
+      <w:pPr>
+        <w:pStyle w:val="Heading2"/>
+      </w:pPr>
+      <w:r>
+        <w:t>Çka thua</w:t>
       </w:r>
     </w:p>
     <w:p>
@@ -1929,7 +1929,7 @@
         <w:rPr>
           <w:sz w:val="24"/>
         </w:rPr>
-        <w:t>A Blob is a class that does too much.</w:t>
+        <w:t>Before the results, let me show you the four smells I studied.</w:t>
       </w:r>
     </w:p>
     <w:p>
@@ -1943,7 +1943,7 @@
           <w:color w:val="4C5560"/>
           <w:sz w:val="20"/>
         </w:rPr>
-        <w:t>Blob është një klasë që bën shumë gjëra.</w:t>
+        <w:t>Para rezultateve, po ju tregoj katër erërat që studiova.</w:t>
       </w:r>
     </w:p>
     <w:p>
@@ -1954,7 +1954,7 @@
         <w:rPr>
           <w:sz w:val="24"/>
         </w:rPr>
-        <w:t>A Data Class only holds data and does almost nothing with it.</w:t>
+        <w:t>A Blob is a class that does too much.</w:t>
       </w:r>
     </w:p>
     <w:p>
@@ -1968,7 +1968,7 @@
           <w:color w:val="4C5560"/>
           <w:sz w:val="20"/>
         </w:rPr>
-        <w:t>Data Class vetëm mban të dhëna dhe nuk bën pothuajse asgjë me to.</w:t>
+        <w:t>Blob është një klasë që bën shumë gjëra.</w:t>
       </w:r>
     </w:p>
     <w:p>
@@ -1979,7 +1979,7 @@
         <w:rPr>
           <w:sz w:val="24"/>
         </w:rPr>
-        <w:t>A Long Method is a method that has grown too long.</w:t>
+        <w:t>A Data Class only holds data, and does almost nothing with it.</w:t>
       </w:r>
     </w:p>
     <w:p>
@@ -1993,7 +1993,7 @@
           <w:color w:val="4C5560"/>
           <w:sz w:val="20"/>
         </w:rPr>
-        <w:t>Long Method është një metodë që është zgjatur shumë.</w:t>
+        <w:t>Data Class vetëm mban të dhëna, dhe nuk bën pothuajse asgjë me to.</w:t>
       </w:r>
     </w:p>
     <w:p>
@@ -2004,7 +2004,7 @@
         <w:rPr>
           <w:sz w:val="24"/>
         </w:rPr>
-        <w:t>And Feature Envy is a method that works more with another class than with its own.</w:t>
+        <w:t>A Long Method is a method that has grown too long.</w:t>
       </w:r>
     </w:p>
     <w:p>
@@ -2018,113 +2018,7 @@
           <w:color w:val="4C5560"/>
           <w:sz w:val="20"/>
         </w:rPr>
-        <w:t>Dhe Feature Envy është një metodë që punon më shumë me një klasë tjetër se me klasën e vet.</w:t>
-      </w:r>
-    </w:p>
-    <w:p>
-      <w:pPr>
-        <w:pStyle w:val="Heading2"/>
-      </w:pPr>
-      <w:r>
-        <w:t>Nëse të ngec mendja</w:t>
-      </w:r>
-    </w:p>
-    <w:p>
-      <w:r>
-        <w:t>Blob bën shumë · Data Class vetëm të dhëna · Long Method e gjatë · Feature Envy te klasa tjetër</w:t>
-      </w:r>
-    </w:p>
-    <w:p>
-      <w:r>
-        <w:br w:type="page"/>
-      </w:r>
-    </w:p>
-    <w:p>
-      <w:pPr>
-        <w:pStyle w:val="Heading1"/>
-      </w:pPr>
-      <w:r>
-        <w:t>Sllajdi 5 · JavaSmell measures 26 metrics once and answers with three approaches</w:t>
-      </w:r>
-    </w:p>
-    <w:p>
-      <w:r>
-        <w:rPr>
-          <w:b/>
-        </w:rPr>
-        <w:t xml:space="preserve">Mesazhi: </w:t>
-      </w:r>
-      <w:r>
-        <w:t>Një mjet, 26 metrika, tri qasje: A rregulla, B modele, C një motor që ndreq dhe çdo ndreqje e kontrollon me javac.</w:t>
-      </w:r>
-    </w:p>
-    <w:p>
-      <w:r>
-        <w:t>Koha: rreth 45 sekonda në versionin e shkurtër, 54 në atë 9-minutësh.</w:t>
-      </w:r>
-    </w:p>
-    <w:p>
-      <w:pPr>
-        <w:pStyle w:val="Heading2"/>
-      </w:pPr>
-      <w:r>
-        <w:t>Çka shihet në sllajd</w:t>
-      </w:r>
-    </w:p>
-    <w:p>
-      <w:pPr>
-        <w:pStyle w:val="ListBullet"/>
-      </w:pPr>
-      <w:r>
-        <w:t>Majtas, rrjedha e mjetit nga lart poshtë: kodi Java → 26 metrika për çdo klasë e metodë → dy kuti krah për krah, A (8 rregulla të botuara) dhe B (mësimi makinerik) → erërat, secila me kushtet që e shkaktuan → C, motori që rishkruan vetëm atë që vërteton → kontrolli me javac dhe një patch, pa e prekur origjinalin.</w:t>
-      </w:r>
-    </w:p>
-    <w:p>
-      <w:pPr>
-        <w:pStyle w:val="ListBullet"/>
-      </w:pPr>
-      <w:r>
-        <w:t>AST është pema e sintaksës: kodi i kthyer në pemë, si analiza gramatikore e një fjalie. javac është kompajleri i Java-s: programi që e kthen kodin në program të ekzekutueshëm dhe tregon gabimet.</w:t>
-      </w:r>
-    </w:p>
-    <w:p>
-      <w:pPr>
-        <w:pStyle w:val="ListBullet"/>
-      </w:pPr>
-      <w:r>
-        <w:t>Djathtas, një copë e zmadhuar e ndërfaqes web gjatë analizës së jsoup-it (një librari e njohur Java për faqet HTML), shqip: dy gjetje, secila me kushtet e veta, p.sh. «Rreshtat e kodit të metodës: 53 (problem kur është mbi 30)».</w:t>
-      </w:r>
-    </w:p>
-    <w:p>
-      <w:pPr>
-        <w:pStyle w:val="Heading2"/>
-      </w:pPr>
-      <w:r>
-        <w:t>Ku të tregosh</w:t>
-      </w:r>
-    </w:p>
-    <w:p>
-      <w:pPr>
-        <w:pStyle w:val="ListBullet"/>
-      </w:pPr>
-      <w:r>
-        <w:t>Ndiqe rrjedhën me dorë nga lart poshtë: te «Part A…» kutia A, te «Part B…» kutia B, te «Part C…» kutia C.</w:t>
-      </w:r>
-    </w:p>
-    <w:p>
-      <w:pPr>
-        <w:pStyle w:val="ListBullet"/>
-      </w:pPr>
-      <w:r>
-        <w:t>Te «On the right you see the web interface», trego foton djathtas.</w:t>
-      </w:r>
-    </w:p>
-    <w:p>
-      <w:pPr>
-        <w:pStyle w:val="Heading2"/>
-      </w:pPr>
-      <w:r>
-        <w:t>Çka thua</w:t>
+        <w:t>Long Method është një metodë që është zgjatur shumë.</w:t>
       </w:r>
     </w:p>
     <w:p>
@@ -2135,7 +2029,7 @@
         <w:rPr>
           <w:sz w:val="24"/>
         </w:rPr>
-        <w:t>To answer the three questions, I built a tool called JavaSmell.</w:t>
+        <w:t>And Feature Envy is a method that works more with another class than with its own.</w:t>
       </w:r>
     </w:p>
     <w:p>
@@ -2149,7 +2043,113 @@
           <w:color w:val="4C5560"/>
           <w:sz w:val="20"/>
         </w:rPr>
-        <w:t>Për t'iu përgjigjur tri pyetjeve, ndërtova një mjet që quhet JavaSmell.</w:t>
+        <w:t>Dhe Feature Envy është një metodë që punon më shumë me një klasë tjetër se me klasën e vet.</w:t>
+      </w:r>
+    </w:p>
+    <w:p>
+      <w:pPr>
+        <w:pStyle w:val="Heading2"/>
+      </w:pPr>
+      <w:r>
+        <w:t>Nëse të ngec mendja</w:t>
+      </w:r>
+    </w:p>
+    <w:p>
+      <w:r>
+        <w:t>Blob bën shumë · Data Class vetëm të dhëna · Long Method e gjatë · Feature Envy te klasa tjetër</w:t>
+      </w:r>
+    </w:p>
+    <w:p>
+      <w:r>
+        <w:br w:type="page"/>
+      </w:r>
+    </w:p>
+    <w:p>
+      <w:pPr>
+        <w:pStyle w:val="Heading1"/>
+      </w:pPr>
+      <w:r>
+        <w:t>Sllajdi 5 · JavaSmell measures 26 metrics once and answers with three approaches</w:t>
+      </w:r>
+    </w:p>
+    <w:p>
+      <w:r>
+        <w:rPr>
+          <w:b/>
+        </w:rPr>
+        <w:t xml:space="preserve">Mesazhi: </w:t>
+      </w:r>
+      <w:r>
+        <w:t>Një mjet, 26 metrika, tri qasje: A rregulla, B modele, C një motor që ndreq dhe çdo ndreqje e kontrollon me javac.</w:t>
+      </w:r>
+    </w:p>
+    <w:p>
+      <w:r>
+        <w:t>Koha: rreth 56 sekonda në versionin e shkurtër, 65 në atë 9-minutësh.</w:t>
+      </w:r>
+    </w:p>
+    <w:p>
+      <w:pPr>
+        <w:pStyle w:val="Heading2"/>
+      </w:pPr>
+      <w:r>
+        <w:t>Çka shihet në sllajd</w:t>
+      </w:r>
+    </w:p>
+    <w:p>
+      <w:pPr>
+        <w:pStyle w:val="ListBullet"/>
+      </w:pPr>
+      <w:r>
+        <w:t>Majtas, rrjedha e mjetit nga lart poshtë: kodi Java → 26 metrika për çdo klasë e metodë → dy kuti krah për krah, A (8 rregulla të botuara) dhe B (mësimi makinerik) → erërat, secila me kushtet që e shkaktuan → C, motori që rishkruan vetëm atë që vërteton → kontrolli me javac dhe një patch, pa e prekur origjinalin.</w:t>
+      </w:r>
+    </w:p>
+    <w:p>
+      <w:pPr>
+        <w:pStyle w:val="ListBullet"/>
+      </w:pPr>
+      <w:r>
+        <w:t>AST është pema e sintaksës: kodi i kthyer në pemë, si analiza gramatikore e një fjalie. javac është kompajleri i Java-s: programi që e kthen kodin në program të ekzekutueshëm dhe tregon gabimet.</w:t>
+      </w:r>
+    </w:p>
+    <w:p>
+      <w:pPr>
+        <w:pStyle w:val="ListBullet"/>
+      </w:pPr>
+      <w:r>
+        <w:t>Djathtas, një copë e zmadhuar e ndërfaqes web gjatë analizës së jsoup-it (një librari e njohur Java për faqet HTML), shqip: dy gjetje, secila me kushtet e veta, p.sh. «Rreshtat e kodit të metodës: 53 (problem kur është mbi 30)».</w:t>
+      </w:r>
+    </w:p>
+    <w:p>
+      <w:pPr>
+        <w:pStyle w:val="Heading2"/>
+      </w:pPr>
+      <w:r>
+        <w:t>Ku të tregosh</w:t>
+      </w:r>
+    </w:p>
+    <w:p>
+      <w:pPr>
+        <w:pStyle w:val="ListBullet"/>
+      </w:pPr>
+      <w:r>
+        <w:t>Ndiqe rrjedhën me dorë nga lart poshtë: te «Part A…» kutia A, te «Part B…» kutia B, te «Part C…» kutia C.</w:t>
+      </w:r>
+    </w:p>
+    <w:p>
+      <w:pPr>
+        <w:pStyle w:val="ListBullet"/>
+      </w:pPr>
+      <w:r>
+        <w:t>Te «On the right you see the web interface», trego foton djathtas.</w:t>
+      </w:r>
+    </w:p>
+    <w:p>
+      <w:pPr>
+        <w:pStyle w:val="Heading2"/>
+      </w:pPr>
+      <w:r>
+        <w:t>Çka thua</w:t>
       </w:r>
     </w:p>
     <w:p>
@@ -2160,7 +2160,7 @@
         <w:rPr>
           <w:sz w:val="24"/>
         </w:rPr>
-        <w:t>It reads Java code and measures 26 numbers for every class and method, like the number of lines or how complex the code is.</w:t>
+        <w:t>To find these smells, and to fix them, I built a tool called JavaSmell.</w:t>
       </w:r>
     </w:p>
     <w:p>
@@ -2174,7 +2174,7 @@
           <w:color w:val="4C5560"/>
           <w:sz w:val="20"/>
         </w:rPr>
-        <w:t>E lexon kodin Java dhe mat 26 numra për çdo klasë dhe metodë, si numri i rreshtave ose sa i ndërlikuar është kodi.</w:t>
+        <w:t>Për t'i gjetur këto erëra, dhe për t'i ndrequr, ndërtova një mjet që quhet JavaSmell.</w:t>
       </w:r>
     </w:p>
     <w:p>
@@ -2185,7 +2185,7 @@
         <w:rPr>
           <w:sz w:val="24"/>
         </w:rPr>
-        <w:t>Part A uses 8 rules from well-known books and papers.</w:t>
+        <w:t>First, it reads the Java code and measures 26 numbers for every class and method, like the number of lines, or how complex the code is.</w:t>
       </w:r>
     </w:p>
     <w:p>
@@ -2199,7 +2199,7 @@
           <w:color w:val="4C5560"/>
           <w:sz w:val="20"/>
         </w:rPr>
-        <w:t>Pjesa A përdor 8 rregulla nga libra dhe artikuj të njohur.</w:t>
+        <w:t>Së pari, e lexon kodin Java dhe mat 26 numra për çdo klasë dhe metodë, si numri i rreshtave, ose sa i ndërlikuar është kodi.</w:t>
       </w:r>
     </w:p>
     <w:p>
@@ -2210,7 +2210,7 @@
         <w:rPr>
           <w:sz w:val="24"/>
         </w:rPr>
-        <w:t>Part B uses machine learning on the same numbers.</w:t>
+        <w:t>Then it uses these numbers in three ways.</w:t>
       </w:r>
     </w:p>
     <w:p>
@@ -2224,7 +2224,7 @@
           <w:color w:val="4C5560"/>
           <w:sz w:val="20"/>
         </w:rPr>
-        <w:t>Pjesa B përdor mësimin makinerik mbi të njëjtët numra.</w:t>
+        <w:t>Pastaj këta numra i përdor në tri mënyra.</w:t>
       </w:r>
     </w:p>
     <w:p>
@@ -2235,7 +2235,7 @@
         <w:rPr>
           <w:sz w:val="24"/>
         </w:rPr>
-        <w:t>Part C fixes the code, but only when it can prove that the change is safe.</w:t>
+        <w:t>Part A uses 8 rules from well-known books and papers.</w:t>
       </w:r>
     </w:p>
     <w:p>
@@ -2249,7 +2249,57 @@
           <w:color w:val="4C5560"/>
           <w:sz w:val="20"/>
         </w:rPr>
-        <w:t>Pjesa C e ndreq kodin, por vetëm kur mund ta vërtetojë që ndryshimi është i sigurt.</w:t>
+        <w:t>Pjesa A përdor 8 rregulla nga libra dhe artikuj të njohur.</w:t>
+      </w:r>
+    </w:p>
+    <w:p>
+      <w:pPr>
+        <w:spacing w:after="0"/>
+      </w:pPr>
+      <w:r>
+        <w:rPr>
+          <w:sz w:val="24"/>
+        </w:rPr>
+        <w:t>Part B uses machine learning on the same numbers.</w:t>
+      </w:r>
+    </w:p>
+    <w:p>
+      <w:pPr>
+        <w:spacing w:after="160"/>
+        <w:ind w:left="360"/>
+      </w:pPr>
+      <w:r>
+        <w:rPr>
+          <w:i/>
+          <w:color w:val="4C5560"/>
+          <w:sz w:val="20"/>
+        </w:rPr>
+        <w:t>Pjesa B përdor mësimin makinerik mbi të njëjtët numra.</w:t>
+      </w:r>
+    </w:p>
+    <w:p>
+      <w:pPr>
+        <w:spacing w:after="0"/>
+      </w:pPr>
+      <w:r>
+        <w:rPr>
+          <w:sz w:val="24"/>
+        </w:rPr>
+        <w:t>And Part C fixes the code, but only when it can prove that the change is safe.</w:t>
+      </w:r>
+    </w:p>
+    <w:p>
+      <w:pPr>
+        <w:spacing w:after="160"/>
+        <w:ind w:left="360"/>
+      </w:pPr>
+      <w:r>
+        <w:rPr>
+          <w:i/>
+          <w:color w:val="4C5560"/>
+          <w:sz w:val="20"/>
+        </w:rPr>
+        <w:t>Dhe pjesa C e ndreq kodin, por vetëm kur mund ta vërtetojë që ndryshimi është i sigurt.</w:t>
       </w:r>
     </w:p>
     <w:p>
@@ -2269,7 +2319,7 @@
           <w:color w:val="2F6F45"/>
           <w:sz w:val="24"/>
         </w:rPr>
-        <w:t>Every finding also says why, for example: this method has 53 lines, and the limit is 30.</w:t>
+        <w:t>Every finding also says why. For example: this method has 53 lines, and the limit is 30.</w:t>
       </w:r>
     </w:p>
     <w:p>
@@ -2283,7 +2333,7 @@
           <w:color w:val="4C5560"/>
           <w:sz w:val="20"/>
         </w:rPr>
-        <w:t>Çdo gjetje thotë edhe pse, për shembull: kjo metodë ka 53 rreshta, dhe kufiri është 30.</w:t>
+        <w:t>Çdo gjetje thotë edhe pse. Për shembull: kjo metodë ka 53 rreshta, dhe kufiri është 30.</w:t>
       </w:r>
     </w:p>
     <w:p>
@@ -2294,7 +2344,7 @@
         <w:rPr>
           <w:sz w:val="24"/>
         </w:rPr>
-        <w:t>On the right you see the web interface, in plain Albanian, for people who are not experts.</w:t>
+        <w:t>On the right you see the web interface. It explains everything in plain Albanian, so you do not need to be an expert.</w:t>
       </w:r>
     </w:p>
     <w:p>
@@ -2308,7 +2358,7 @@
           <w:color w:val="4C5560"/>
           <w:sz w:val="20"/>
         </w:rPr>
-        <w:t>Djathtas shihni ndërfaqen web, në shqip të thjeshtë, për njerëzit që nuk janë ekspertë.</w:t>
+        <w:t>Djathtas shihni ndërfaqen web. Gjithçka e shpjegon në shqip të thjeshtë, ndaj nuk ke nevojë të jesh ekspert.</w:t>
       </w:r>
     </w:p>
     <w:p>
@@ -2728,7 +2778,7 @@
     </w:p>
     <w:p>
       <w:r>
-        <w:t>Koha: rreth 48 sekonda në versionin e shkurtër, 62 në atë 9-minutësh.</w:t>
+        <w:t>Koha: rreth 58 sekonda në versionin e shkurtër, 73 në atë 9-minutësh.</w:t>
       </w:r>
     </w:p>
     <w:p>
@@ -2819,7 +2869,7 @@
         <w:rPr>
           <w:sz w:val="24"/>
         </w:rPr>
-        <w:t>To test the tool fairly, I need answers from real people.</w:t>
+        <w:t>But a tool is only useful if its answers are right. To check that, I need answers from real people.</w:t>
       </w:r>
     </w:p>
     <w:p>
@@ -2833,7 +2883,7 @@
           <w:color w:val="4C5560"/>
           <w:sz w:val="20"/>
         </w:rPr>
-        <w:t>Për ta provuar mjetin në mënyrë të drejtë, më duhen përgjigje nga njerëz të vërtetë.</w:t>
+        <w:t>Por një mjet vlen vetëm nëse përgjigjet e tij janë të sakta. Për ta kontrolluar këtë, më duhen përgjigje nga njerëz të vërtetë.</w:t>
       </w:r>
     </w:p>
     <w:p>
@@ -2844,7 +2894,7 @@
         <w:rPr>
           <w:sz w:val="24"/>
         </w:rPr>
-        <w:t>I used MLCQ, a public dataset where professional developers judged real Java code.</w:t>
+        <w:t>So I used MLCQ, a public dataset where professional developers judged real Java code.</w:t>
       </w:r>
     </w:p>
     <w:p>
@@ -2858,7 +2908,7 @@
           <w:color w:val="4C5560"/>
           <w:sz w:val="20"/>
         </w:rPr>
-        <w:t>Përdora MLCQ, një bazë publike të dhënash ku programues profesionistë gjykuan kod të vërtetë Java.</w:t>
+        <w:t>Prandaj përdora MLCQ, një bazë publike të dhënash ku programues profesionistë gjykuan kod të vërtetë Java.</w:t>
       </w:r>
     </w:p>
     <w:p>
@@ -2869,7 +2919,7 @@
         <w:rPr>
           <w:sz w:val="24"/>
         </w:rPr>
-        <w:t>In total I have 9,046 pieces of code from 512 open-source projects.</w:t>
+        <w:t>In total, I have 9,046 pieces of code from 512 open-source projects.</w:t>
       </w:r>
     </w:p>
     <w:p>
@@ -2894,7 +2944,7 @@
         <w:rPr>
           <w:sz w:val="24"/>
         </w:rPr>
-        <w:t>A model is never tested on a project it has already seen: it learns from four groups of projects and is tested on the fifth.</w:t>
+        <w:t>And the test is fair: a model is never tested on a project it has already seen. It learns from four groups of projects, and it is tested on the fifth.</w:t>
       </w:r>
     </w:p>
     <w:p>
@@ -2908,7 +2958,7 @@
           <w:color w:val="4C5560"/>
           <w:sz w:val="20"/>
         </w:rPr>
-        <w:t>Një model nuk provohet kurrë mbi një projekt që e ka parë: mëson nga katër grupe projektesh dhe provohet te i pesti.</w:t>
+        <w:t>Dhe prova është e drejtë: një model nuk provohet kurrë mbi një projekt që e ka parë. Mëson nga katër grupe projektesh, dhe provohet te i pesti.</w:t>
       </w:r>
     </w:p>
     <w:p>
@@ -2928,7 +2978,7 @@
           <w:color w:val="2F6F45"/>
           <w:sz w:val="24"/>
         </w:rPr>
-        <w:t>Code from the same project looks very similar, so testing on a project it has seen would be like an exam where you already know the answers.</w:t>
+        <w:t>This matters, because code from the same project looks very similar. Testing on a project it has seen would be like an exam where you already know the answers.</w:t>
       </w:r>
     </w:p>
     <w:p>
@@ -2942,7 +2992,7 @@
           <w:color w:val="4C5560"/>
           <w:sz w:val="20"/>
         </w:rPr>
-        <w:t>Kodi i të njëjtit projekt ngjan shumë, ndaj provimi mbi një projekt të parë do të ishte si një provim ku i di përgjigjet që më parë.</w:t>
+        <w:t>Kjo ka rëndësi, sepse kodi i të njëjtit projekt ngjan shumë. Provimi mbi një projekt të parë do të ishte si një provim ku i di përgjigjet që më parë.</w:t>
       </w:r>
     </w:p>
     <w:p>
@@ -2953,7 +3003,7 @@
         <w:rPr>
           <w:sz w:val="24"/>
         </w:rPr>
-        <w:t>To score the results I use MCC, not simple accuracy.</w:t>
+        <w:t>To score the results, I use MCC, not simple accuracy. Here is why.</w:t>
       </w:r>
     </w:p>
     <w:p>
@@ -2967,7 +3017,7 @@
           <w:color w:val="4C5560"/>
           <w:sz w:val="20"/>
         </w:rPr>
-        <w:t>Për t'i vlerësuar rezultatet përdor MCC-në, jo saktësinë e thjeshtë.</w:t>
+        <w:t>Për t'i vlerësuar rezultatet, përdor MCC-në, jo saktësinë e thjeshtë. Ja pse.</w:t>
       </w:r>
     </w:p>
     <w:p>
@@ -3257,7 +3307,7 @@
     </w:p>
     <w:p>
       <w:r>
-        <w:t>Koha: rreth 46 sekonda në versionin e shkurtër, 62 në atë 9-minutësh.</w:t>
+        <w:t>Koha: rreth 53 sekonda në versionin e shkurtër, 69 në atë 9-minutësh.</w:t>
       </w:r>
     </w:p>
     <w:p>
@@ -3364,7 +3414,7 @@
         <w:rPr>
           <w:sz w:val="24"/>
         </w:rPr>
-        <w:t>Here are the main results.</w:t>
+        <w:t>So, how good are the rules, and can machine learning do better? Here are the main results.</w:t>
       </w:r>
     </w:p>
     <w:p>
@@ -3378,7 +3428,7 @@
           <w:color w:val="4C5560"/>
           <w:sz w:val="20"/>
         </w:rPr>
-        <w:t>Ja rezultatet kryesore.</w:t>
+        <w:t>Pra, sa të mira janë rregullat, dhe a bën më mirë mësimi makinerik? Ja rezultatet kryesore.</w:t>
       </w:r>
     </w:p>
     <w:p>
@@ -3414,7 +3464,7 @@
         <w:rPr>
           <w:sz w:val="24"/>
         </w:rPr>
-        <w:t>Higher is better: zero means guessing, one means perfect.</w:t>
+        <w:t>Higher is better: zero means guessing, and one means perfect.</w:t>
       </w:r>
     </w:p>
     <w:p>
@@ -3428,7 +3478,7 @@
           <w:color w:val="4C5560"/>
           <w:sz w:val="20"/>
         </w:rPr>
-        <w:t>Sa më lart, aq më mirë: zero do të thotë hamendje, një do të thotë përsosmëri.</w:t>
+        <w:t>Sa më lart, aq më mirë: zero do të thotë hamendje, dhe një do të thotë përsosmëri.</w:t>
       </w:r>
     </w:p>
     <w:p>
@@ -3439,7 +3489,7 @@
         <w:rPr>
           <w:sz w:val="24"/>
         </w:rPr>
-        <w:t>The rules are usually right when they raise an alarm, but out of every 100 real smells, they find only 17 to 47.</w:t>
+        <w:t>The rules are usually right when they raise an alarm. But out of every 100 real smells, they find only 17 to 47.</w:t>
       </w:r>
     </w:p>
     <w:p>
@@ -3453,7 +3503,7 @@
           <w:color w:val="4C5560"/>
           <w:sz w:val="20"/>
         </w:rPr>
-        <w:t>Rregullat zakonisht kanë të drejtë kur alarmojnë, por nga çdo 100 erëra të vërteta gjejnë vetëm 17 deri 47.</w:t>
+        <w:t>Rregullat zakonisht kanë të drejtë kur alarmojnë. Por nga çdo 100 erëra të vërteta, gjejnë vetëm 17 deri 47.</w:t>
       </w:r>
     </w:p>
     <w:p>
@@ -4111,7 +4161,7 @@
     </w:p>
     <w:p>
       <w:r>
-        <w:t>Koha: rreth 34 sekonda në versionin e shkurtër, 38 në atë 9-minutësh.</w:t>
+        <w:t>Koha: rreth 40 sekonda në versionin e shkurtër, 43 në atë 9-minutësh.</w:t>
       </w:r>
     </w:p>
     <w:p>
@@ -4194,7 +4244,7 @@
         <w:rPr>
           <w:sz w:val="24"/>
         </w:rPr>
-        <w:t>Why is Feature Envy so hard?</w:t>
+        <w:t>You may ask: why is Feature Envy so hard, even for machine learning?</w:t>
       </w:r>
     </w:p>
     <w:p>
@@ -4208,7 +4258,7 @@
           <w:color w:val="4C5560"/>
           <w:sz w:val="20"/>
         </w:rPr>
-        <w:t>Pse është Feature Envy kaq e vështirë?</w:t>
+        <w:t>Mund të pyesni: pse është Feature Envy kaq e vështirë, edhe për mësimin makinerik?</w:t>
       </w:r>
     </w:p>
     <w:p>
@@ -4219,7 +4269,7 @@
         <w:rPr>
           <w:sz w:val="24"/>
         </w:rPr>
-        <w:t>I looked at code that two developers judged, and checked how often they agree.</w:t>
+        <w:t>To find out, I looked at code that two developers judged, and checked how often they agree.</w:t>
       </w:r>
     </w:p>
     <w:p>
@@ -4233,7 +4283,7 @@
           <w:color w:val="4C5560"/>
           <w:sz w:val="20"/>
         </w:rPr>
-        <w:t>Shikova kodin që e gjykuan dy programues, dhe kontrollova sa shpesh pajtohen.</w:t>
+        <w:t>Për ta gjetur, shikova kodin që e gjykuan dy programues, dhe kontrollova sa shpesh pajtohen.</w:t>
       </w:r>
     </w:p>
     <w:p>
@@ -4503,7 +4553,7 @@
     </w:p>
     <w:p>
       <w:r>
-        <w:t>Koha: rreth 49 sekonda në versionin e shkurtër, 58 në atë 9-minutësh.</w:t>
+        <w:t>Koha: rreth 63 sekonda në versionin e shkurtër, 72 në atë 9-minutësh.</w:t>
       </w:r>
     </w:p>
     <w:p>
@@ -4591,7 +4641,7 @@
         <w:pStyle w:val="ListBullet"/>
       </w:pPr>
       <w:r>
-        <w:t>Te «The other 16…», trego rreshtin e vogël nën shirit, me shumën.</w:t>
+        <w:t>Te «The last 16…», trego rreshtin e vogël nën shirit, me shumën.</w:t>
       </w:r>
     </w:p>
     <w:p>
@@ -4618,7 +4668,7 @@
         <w:rPr>
           <w:sz w:val="24"/>
         </w:rPr>
-        <w:t>Now the third question: can we fix smells automatically?</w:t>
+        <w:t>So much for finding smells. Now the third question: once we find a smell, can the tool fix it?</w:t>
       </w:r>
     </w:p>
     <w:p>
@@ -4632,7 +4682,7 @@
           <w:color w:val="4C5560"/>
           <w:sz w:val="20"/>
         </w:rPr>
-        <w:t>Tani pyetja e tretë: a mund t'i ndreqim erërat automatikisht?</w:t>
+        <w:t>Kaq për gjetjen e erërave. Tani pyetja e tretë: kur e gjejmë një erë, a mund ta ndreqë mjeti?</w:t>
       </w:r>
     </w:p>
     <w:p>
@@ -4643,7 +4693,7 @@
         <w:rPr>
           <w:sz w:val="24"/>
         </w:rPr>
-        <w:t>The tool knows three fixes: split a long method, turn a big if into an early exit, and group many parameters into one object.</w:t>
+        <w:t>The tool knows three fixes: it can split a long method, turn a big if into an early exit, or group many parameters into one object.</w:t>
       </w:r>
     </w:p>
     <w:p>
@@ -4657,7 +4707,7 @@
           <w:color w:val="4C5560"/>
           <w:sz w:val="20"/>
         </w:rPr>
-        <w:t>Mjeti di tri ndreqje: ndan një metodë të gjatë, kthen një if të madh në një dalje të hershme, dhe mbledh shumë parametra në një objekt.</w:t>
+        <w:t>Mjeti di tri ndreqje: mund ta ndajë një metodë të gjatë, ta kthejë një if të madh në një dalje të hershme, ose t'i mbledhë shumë parametra në një objekt.</w:t>
       </w:r>
     </w:p>
     <w:p>
@@ -4718,7 +4768,7 @@
         <w:rPr>
           <w:sz w:val="24"/>
         </w:rPr>
-        <w:t>It refused 12,252, because it could not prove the change was safe, and it always says why.</w:t>
+        <w:t>It refused 12,252, because it could not prove that the change was safe. And it always says why.</w:t>
       </w:r>
     </w:p>
     <w:p>
@@ -4732,7 +4782,7 @@
           <w:color w:val="4C5560"/>
           <w:sz w:val="20"/>
         </w:rPr>
-        <w:t>Refuzoi 12,252, sepse nuk mundi ta vërtetojë që ndryshimi ishte i sigurt, dhe gjithmonë thotë pse.</w:t>
+        <w:t>Refuzoi 12,252, sepse nuk mundi ta vërtetojë që ndryshimi ishte i sigurt. Dhe gjithmonë thotë pse.</w:t>
       </w:r>
     </w:p>
     <w:p>
@@ -4743,7 +4793,7 @@
         <w:rPr>
           <w:sz w:val="24"/>
         </w:rPr>
-        <w:t>The other 16 could not be found again in the file.</w:t>
+        <w:t>The last 16 could not be found again in the file. Together, that makes 15,800.</w:t>
       </w:r>
     </w:p>
     <w:p>
@@ -4757,7 +4807,7 @@
           <w:color w:val="4C5560"/>
           <w:sz w:val="20"/>
         </w:rPr>
-        <w:t>16 të tjerat nuk u gjetën dot sërish në skedar.</w:t>
+        <w:t>16 të fundit nuk u gjetën dot sërish në skedar. Bashkë, bëjnë 15,800.</w:t>
       </w:r>
     </w:p>
     <w:p>
@@ -4768,7 +4818,7 @@
         <w:rPr>
           <w:sz w:val="24"/>
         </w:rPr>
-        <w:t>For me, a refusal is a good result, not a failure.</w:t>
+        <w:t>For me, a refusal is a good result, not a failure. It is better to refuse than to break someone's code.</w:t>
       </w:r>
     </w:p>
     <w:p>
@@ -4782,7 +4832,7 @@
           <w:color w:val="4C5560"/>
           <w:sz w:val="20"/>
         </w:rPr>
-        <w:t>Për mua, refuzimi është rezultat i mirë, jo dështim.</w:t>
+        <w:t>Për mua, refuzimi është rezultat i mirë, jo dështim. Më mirë të refuzosh, se sa ta prishësh kodin e dikujt.</w:t>
       </w:r>
     </w:p>
     <w:p>
@@ -5150,7 +5200,7 @@
     </w:p>
     <w:p>
       <w:r>
-        <w:t>Koha: rreth 52 sekonda në versionin e shkurtër, 66 në atë 9-minutësh.</w:t>
+        <w:t>Koha: rreth 57 sekonda në versionin e shkurtër, 71 në atë 9-minutësh.</w:t>
       </w:r>
     </w:p>
     <w:p>
@@ -5257,7 +5307,7 @@
         <w:rPr>
           <w:sz w:val="24"/>
         </w:rPr>
-        <w:t>How do I know a rewrite is correct? I check it in steps.</w:t>
+        <w:t>But a rewrite is only useful if it is correct. So how do I check that? Step by step.</w:t>
       </w:r>
     </w:p>
     <w:p>
@@ -5271,7 +5321,7 @@
           <w:color w:val="4C5560"/>
           <w:sz w:val="20"/>
         </w:rPr>
-        <w:t>Si e di që një rishkrim është i saktë? E kontrolloj me hapa.</w:t>
+        <w:t>Por një rishkrim vlen vetëm nëse është i saktë. Atëherë, si e kontrolloj? Hap pas hapi.</w:t>
       </w:r>
     </w:p>
     <w:p>
@@ -5282,7 +5332,7 @@
         <w:rPr>
           <w:sz w:val="24"/>
         </w:rPr>
-        <w:t>Before the change, the tool must prove its conditions on the syntax tree, or it refuses.</w:t>
+        <w:t>First, before the change, the tool must prove its conditions on the syntax tree. If it cannot, it refuses.</w:t>
       </w:r>
     </w:p>
     <w:p>
@@ -5296,7 +5346,7 @@
           <w:color w:val="4C5560"/>
           <w:sz w:val="20"/>
         </w:rPr>
-        <w:t>Para ndryshimit, mjeti duhet t'i vërtetojë kushtet e veta mbi pemën e sintaksës, ose refuzon.</w:t>
+        <w:t>Së pari, para ndryshimit, mjeti duhet t'i vërtetojë kushtet e veta mbi pemën e sintaksës. Nëse nuk mundet, refuzon.</w:t>
       </w:r>
     </w:p>
     <w:p>
@@ -5307,7 +5357,7 @@
         <w:rPr>
           <w:sz w:val="24"/>
         </w:rPr>
-        <w:t>After the change, the compiler checks the file: 98 percent pass, and the 58 that fail are never written.</w:t>
+        <w:t>Second, after the change, the compiler checks the file. 98 percent pass, and the 58 that fail are never written.</w:t>
       </w:r>
     </w:p>
     <w:p>
@@ -5321,7 +5371,7 @@
           <w:color w:val="4C5560"/>
           <w:sz w:val="20"/>
         </w:rPr>
-        <w:t>Pas ndryshimit, kompajleri e kontrollon skedarin: 98 për qind kalojnë, dhe ato 58 që dështojnë nuk shkruhen kurrë.</w:t>
+        <w:t>Së dyti, pas ndryshimit, kompajleri e kontrollon skedarin. 98 për qind kalojnë, dhe ato 58 që dështojnë nuk shkruhen kurrë.</w:t>
       </w:r>
     </w:p>
     <w:p>
@@ -5332,7 +5382,7 @@
         <w:rPr>
           <w:sz w:val="24"/>
         </w:rPr>
-        <w:t>Then the smell is measured again: it is gone after 65 percent of the rewrites.</w:t>
+        <w:t>Third, the smell is measured again. It is gone after 65 percent of the rewrites.</w:t>
       </w:r>
     </w:p>
     <w:p>
@@ -5346,7 +5396,7 @@
           <w:color w:val="4C5560"/>
           <w:sz w:val="20"/>
         </w:rPr>
-        <w:t>Pastaj era matet sërish: zhduket pas 65 për qind të rishkrimeve.</w:t>
+        <w:t>Së treti, era matet sërish. Zhduket pas 65 për qind të rishkrimeve.</w:t>
       </w:r>
     </w:p>
     <w:p>
@@ -5366,7 +5416,7 @@
           <w:color w:val="2F6F45"/>
           <w:sz w:val="24"/>
         </w:rPr>
-        <w:t>On a sample of 201 rewrites, I also compiled the whole project: 66 compiled fully, and 2 had an error that the single file had hidden.</w:t>
+        <w:t>I also took a sample of 201 rewrites and compiled the whole project: 66 compiled fully, and 2 had an error that the single file had hidden.</w:t>
       </w:r>
     </w:p>
     <w:p>
@@ -5380,7 +5430,7 @@
           <w:color w:val="4C5560"/>
           <w:sz w:val="20"/>
         </w:rPr>
-        <w:t>Te një mostër prej 201 rishkrimesh, kompilova edhe gjithë projektin: 66 u kompiluan plotësisht, dhe 2 kishin një gabim që skedari i vetëm e kishte fshehur.</w:t>
+        <w:t>Mora edhe një mostër prej 201 rishkrimesh dhe kompilova gjithë projektin: 66 u kompiluan plotësisht, dhe 2 kishin një gabim që skedari i vetëm e kishte fshehur.</w:t>
       </w:r>
     </w:p>
     <w:p>
@@ -5391,7 +5441,7 @@
         <w:rPr>
           <w:sz w:val="24"/>
         </w:rPr>
-        <w:t>Finally, I read 60 rewrites by hand: about 63 percent were acceptable, and one changed the behavior.</w:t>
+        <w:t>Finally, I read 60 rewrites by hand. About 63 percent were acceptable, and one changed the behavior.</w:t>
       </w:r>
     </w:p>
     <w:p>
@@ -5405,7 +5455,7 @@
           <w:color w:val="4C5560"/>
           <w:sz w:val="20"/>
         </w:rPr>
-        <w:t>Në fund, lexova 60 rishkrime me dorë: rreth 63 për qind ishin të pranueshme, dhe 1 e ndryshonte sjelljen.</w:t>
+        <w:t>Në fund, lexova 60 rishkrime me dorë. Rreth 63 për qind ishin të pranueshme, dhe 1 e ndryshonte sjelljen.</w:t>
       </w:r>
     </w:p>
     <w:p>
@@ -5472,7 +5522,7 @@
     </w:p>
     <w:p>
       <w:r>
-        <w:t>Koha: rreth 30 sekonda në versionin e shkurtër, 40 në atë 9-minutësh.</w:t>
+        <w:t>Koha: rreth 35 sekonda në versionin e shkurtër, 45 në atë 9-minutësh.</w:t>
       </w:r>
     </w:p>
     <w:p>
@@ -5563,7 +5613,7 @@
         <w:rPr>
           <w:sz w:val="24"/>
         </w:rPr>
-        <w:t>Here is one real example, from the Apache Geode project.</w:t>
+        <w:t>Let me show you what one of these rewrites looks like. This is real code, from the Apache Geode project.</w:t>
       </w:r>
     </w:p>
     <w:p>
@@ -5577,7 +5627,7 @@
           <w:color w:val="4C5560"/>
           <w:sz w:val="20"/>
         </w:rPr>
-        <w:t>Ja një shembull i vërtetë, nga projekti Apache Geode.</w:t>
+        <w:t>Po ju tregoj si duket një nga këto rishkrime. Ky është kod i vërtetë, nga projekti Apache Geode.</w:t>
       </w:r>
     </w:p>
     <w:p>
@@ -5647,7 +5697,7 @@
           <w:color w:val="2F6F45"/>
           <w:sz w:val="24"/>
         </w:rPr>
-        <w:t>The tool only does this when the method returns nothing and its whole body is one if, without else.</w:t>
+        <w:t>The tool only does this when the method returns nothing, and its whole body is one if, without else.</w:t>
       </w:r>
     </w:p>
     <w:p>
@@ -5661,7 +5711,7 @@
           <w:color w:val="4C5560"/>
           <w:sz w:val="20"/>
         </w:rPr>
-        <w:t>Mjeti e bën këtë vetëm kur metoda nuk kthen asgjë dhe i gjithë trupi i saj është një if, pa else.</w:t>
+        <w:t>Mjeti e bën këtë vetëm kur metoda nuk kthen asgjë, dhe i gjithë trupi i saj është një if, pa else.</w:t>
       </w:r>
     </w:p>
     <w:p>
@@ -5728,7 +5778,7 @@
     </w:p>
     <w:p>
       <w:r>
-        <w:t>Koha: rreth 62 sekonda në versionin e shkurtër, 76 në atë 9-minutësh.</w:t>
+        <w:t>Koha: rreth 70 sekonda në versionin e shkurtër, 85 në atë 9-minutësh.</w:t>
       </w:r>
     </w:p>
     <w:p>
@@ -5792,7 +5842,7 @@
         <w:pStyle w:val="ListBullet"/>
       </w:pPr>
       <w:r>
-        <w:t>Te «So, the three answers», trego Q1, Q2 dhe Q3 me radhë.</w:t>
+        <w:t>Te «My three questions have three answers», trego Q1, Q2 dhe Q3 me radhë.</w:t>
       </w:r>
     </w:p>
     <w:p>
@@ -5800,7 +5850,7 @@
         <w:pStyle w:val="ListBullet"/>
       </w:pPr>
       <w:r>
-        <w:t>Te «In practice…», trego «Why it matters»; te «Next…», «Future research».</w:t>
+        <w:t>Te «Why does this matter in practice?», trego «Why it matters»; te «And what comes next?», «Future research».</w:t>
       </w:r>
     </w:p>
     <w:p>
@@ -5827,7 +5877,7 @@
         <w:rPr>
           <w:sz w:val="24"/>
         </w:rPr>
-        <w:t>So, the three answers.</w:t>
+        <w:t>Let me bring it all together. My three questions have three answers.</w:t>
       </w:r>
     </w:p>
     <w:p>
@@ -5841,7 +5891,7 @@
           <w:color w:val="4C5560"/>
           <w:sz w:val="20"/>
         </w:rPr>
-        <w:t>Pra, tri përgjigjet.</w:t>
+        <w:t>Po i bashkoj të gjitha. Tri pyetjet e mia kanë tri përgjigje.</w:t>
       </w:r>
     </w:p>
     <w:p>
@@ -5927,7 +5977,7 @@
         <w:rPr>
           <w:sz w:val="24"/>
         </w:rPr>
-        <w:t>In practice, published thresholds are a starting point, not a final answer, and an automatic fix is a proposal that a developer reviews.</w:t>
+        <w:t>Why does this matter in practice? Published thresholds are a starting point, not a final answer. And an automatic fix is a proposal that a developer still reviews.</w:t>
       </w:r>
     </w:p>
     <w:p>
@@ -5941,7 +5991,7 @@
           <w:color w:val="4C5560"/>
           <w:sz w:val="20"/>
         </w:rPr>
-        <w:t>Në praktikë, pragjet e botuara janë pikënisje, jo përgjigje përfundimtare, dhe një ndreqje automatike është propozim që programuesi e rishikon.</w:t>
+        <w:t>Pse ka rëndësi kjo në praktikë? Pragjet e botuara janë pikënisje, jo përgjigje përfundimtare. Dhe një ndreqje automatike është propozim që programuesi e rishikon prapë.</w:t>
       </w:r>
     </w:p>
     <w:p>
@@ -5952,7 +6002,7 @@
         <w:rPr>
           <w:sz w:val="24"/>
         </w:rPr>
-        <w:t>Next, I want to run the projects' own tests, support more fixes, and ask other developers to judge the changes.</w:t>
+        <w:t>And what comes next? I want to run the projects' own tests, support more fixes, and ask other developers to judge the changes.</w:t>
       </w:r>
     </w:p>
     <w:p>
@@ -5966,7 +6016,7 @@
           <w:color w:val="4C5560"/>
           <w:sz w:val="20"/>
         </w:rPr>
-        <w:t>Më pas dua t'i ekzekutoj testet e vetë projekteve, të shtoj më shumë ndreqje, dhe t'u kërkoj programuesve të tjerë t'i gjykojnë ndryshimet.</w:t>
+        <w:t>Dhe çka vjen më pas? Dua t'i ekzekutoj testet e vetë projekteve, të shtoj më shumë ndreqje, dhe t'u kërkoj programuesve të tjerë t'i gjykojnë ndryshimet.</w:t>
       </w:r>
     </w:p>
     <w:p>

</xml_diff>